<commit_message>
Update documentation: Week 3 UI design with Figma wireframes
</commit_message>
<xml_diff>
--- a/Documentation of dukastock.docx
+++ b/Documentation of dukastock.docx
@@ -125,12 +125,6 @@
         <w:gridCol w:w="6360"/>
       </w:tblGrid>
       <w:tr>
-        <w:tblPrEx>
-          <w:tblCellMar>
-            <w:top w:w="0" w:type="dxa"/>
-            <w:bottom w:w="0" w:type="dxa"/>
-          </w:tblCellMar>
-        </w:tblPrEx>
         <w:tc>
           <w:tcPr>
             <w:tcW w:w="3000" w:type="dxa"/>
@@ -217,12 +211,6 @@
         <w:gridCol w:w="6360"/>
       </w:tblGrid>
       <w:tr>
-        <w:tblPrEx>
-          <w:tblCellMar>
-            <w:top w:w="0" w:type="dxa"/>
-            <w:bottom w:w="0" w:type="dxa"/>
-          </w:tblCellMar>
-        </w:tblPrEx>
         <w:tc>
           <w:tcPr>
             <w:tcW w:w="3000" w:type="dxa"/>
@@ -309,12 +297,6 @@
         <w:gridCol w:w="6360"/>
       </w:tblGrid>
       <w:tr>
-        <w:tblPrEx>
-          <w:tblCellMar>
-            <w:top w:w="0" w:type="dxa"/>
-            <w:bottom w:w="0" w:type="dxa"/>
-          </w:tblCellMar>
-        </w:tblPrEx>
         <w:tc>
           <w:tcPr>
             <w:tcW w:w="3000" w:type="dxa"/>
@@ -401,12 +383,6 @@
         <w:gridCol w:w="6360"/>
       </w:tblGrid>
       <w:tr>
-        <w:tblPrEx>
-          <w:tblCellMar>
-            <w:top w:w="0" w:type="dxa"/>
-            <w:bottom w:w="0" w:type="dxa"/>
-          </w:tblCellMar>
-        </w:tblPrEx>
         <w:tc>
           <w:tcPr>
             <w:tcW w:w="3000" w:type="dxa"/>
@@ -428,7 +404,6 @@
             <w:pPr>
               <w:shd w:val="clear" w:color="auto" w:fill="FFFFFF" w:themeFill="background1"/>
             </w:pPr>
-            <w:proofErr w:type="spellStart"/>
             <w:r>
               <w:rPr>
                 <w:b/>
@@ -436,7 +411,6 @@
               </w:rPr>
               <w:t>Programme</w:t>
             </w:r>
-            <w:proofErr w:type="spellEnd"/>
           </w:p>
         </w:tc>
         <w:tc>
@@ -495,12 +469,6 @@
         <w:gridCol w:w="6360"/>
       </w:tblGrid>
       <w:tr>
-        <w:tblPrEx>
-          <w:tblCellMar>
-            <w:top w:w="0" w:type="dxa"/>
-            <w:bottom w:w="0" w:type="dxa"/>
-          </w:tblCellMar>
-        </w:tblPrEx>
         <w:tc>
           <w:tcPr>
             <w:tcW w:w="3000" w:type="dxa"/>
@@ -587,12 +555,6 @@
         <w:gridCol w:w="6360"/>
       </w:tblGrid>
       <w:tr>
-        <w:tblPrEx>
-          <w:tblCellMar>
-            <w:top w:w="0" w:type="dxa"/>
-            <w:bottom w:w="0" w:type="dxa"/>
-          </w:tblCellMar>
-        </w:tblPrEx>
         <w:tc>
           <w:tcPr>
             <w:tcW w:w="3000" w:type="dxa"/>
@@ -679,12 +641,6 @@
         <w:gridCol w:w="6360"/>
       </w:tblGrid>
       <w:tr>
-        <w:tblPrEx>
-          <w:tblCellMar>
-            <w:top w:w="0" w:type="dxa"/>
-            <w:bottom w:w="0" w:type="dxa"/>
-          </w:tblCellMar>
-        </w:tblPrEx>
         <w:tc>
           <w:tcPr>
             <w:tcW w:w="3000" w:type="dxa"/>
@@ -771,12 +727,6 @@
         <w:gridCol w:w="6360"/>
       </w:tblGrid>
       <w:tr>
-        <w:tblPrEx>
-          <w:tblCellMar>
-            <w:top w:w="0" w:type="dxa"/>
-            <w:bottom w:w="0" w:type="dxa"/>
-          </w:tblCellMar>
-        </w:tblPrEx>
         <w:tc>
           <w:tcPr>
             <w:tcW w:w="3000" w:type="dxa"/>
@@ -863,12 +813,6 @@
         <w:gridCol w:w="6360"/>
       </w:tblGrid>
       <w:tr>
-        <w:tblPrEx>
-          <w:tblCellMar>
-            <w:top w:w="0" w:type="dxa"/>
-            <w:bottom w:w="0" w:type="dxa"/>
-          </w:tblCellMar>
-        </w:tblPrEx>
         <w:tc>
           <w:tcPr>
             <w:tcW w:w="3000" w:type="dxa"/>
@@ -955,12 +899,6 @@
         <w:gridCol w:w="6360"/>
       </w:tblGrid>
       <w:tr>
-        <w:tblPrEx>
-          <w:tblCellMar>
-            <w:top w:w="0" w:type="dxa"/>
-            <w:bottom w:w="0" w:type="dxa"/>
-          </w:tblCellMar>
-        </w:tblPrEx>
         <w:tc>
           <w:tcPr>
             <w:tcW w:w="3000" w:type="dxa"/>
@@ -1996,27 +1934,7 @@
                 <w:noProof/>
                 <w:color w:val="auto"/>
               </w:rPr>
-              <w:t>Personal Re</w:t>
-            </w:r>
-            <w:r>
-              <w:rPr>
-                <w:rStyle w:val="Hyperlink"/>
-                <w:b/>
-                <w:bCs/>
-                <w:noProof/>
-                <w:color w:val="auto"/>
-              </w:rPr>
-              <w:t>f</w:t>
-            </w:r>
-            <w:r>
-              <w:rPr>
-                <w:rStyle w:val="Hyperlink"/>
-                <w:b/>
-                <w:bCs/>
-                <w:noProof/>
-                <w:color w:val="auto"/>
-              </w:rPr>
-              <w:t>lection</w:t>
+              <w:t>Personal Reflection</w:t>
             </w:r>
             <w:r>
               <w:rPr>
@@ -2513,20 +2431,7 @@
         <w:contextualSpacing w:val="0"/>
       </w:pPr>
       <w:r>
-        <w:t xml:space="preserve">Created a GitHub account and set up the DukaStock repository with </w:t>
-      </w:r>
-      <w:proofErr w:type="gramStart"/>
-      <w:r>
-        <w:t>Flutter .</w:t>
-      </w:r>
-      <w:proofErr w:type="spellStart"/>
-      <w:r>
-        <w:t>gitignore</w:t>
-      </w:r>
-      <w:proofErr w:type="spellEnd"/>
-      <w:proofErr w:type="gramEnd"/>
-      <w:r>
-        <w:t xml:space="preserve"> and README</w:t>
+        <w:t>Created a GitHub account and set up the DukaStock repository with Flutter .gitignore and README</w:t>
       </w:r>
     </w:p>
     <w:p>
@@ -2596,15 +2501,7 @@
         <w:contextualSpacing w:val="0"/>
       </w:pPr>
       <w:r>
-        <w:t xml:space="preserve">Created and configured a Pixel 6 Android Virtual Device with API 37 (Android 17.0 </w:t>
-      </w:r>
-      <w:proofErr w:type="spellStart"/>
-      <w:r>
-        <w:t>CinnamonBun</w:t>
-      </w:r>
-      <w:proofErr w:type="spellEnd"/>
-      <w:r>
-        <w:t>)</w:t>
+        <w:t>Created and configured a Pixel 6 Android Virtual Device with API 37 (Android 17.0 CinnamonBun)</w:t>
       </w:r>
     </w:p>
     <w:p>
@@ -2618,17 +2515,7 @@
         <w:contextualSpacing w:val="0"/>
       </w:pPr>
       <w:r>
-        <w:t xml:space="preserve">Customized </w:t>
-      </w:r>
-      <w:proofErr w:type="spellStart"/>
-      <w:proofErr w:type="gramStart"/>
-      <w:r>
-        <w:t>main.dart</w:t>
-      </w:r>
-      <w:proofErr w:type="spellEnd"/>
-      <w:proofErr w:type="gramEnd"/>
-      <w:r>
-        <w:t xml:space="preserve"> — changed app title to DukaStock, theme color to green, added Welcome to DukaStock! text</w:t>
+        <w:t>Customized main.dart — changed app title to DukaStock, theme color to green, added Welcome to DukaStock! text</w:t>
       </w:r>
     </w:p>
     <w:p>
@@ -2728,12 +2615,6 @@
         <w:gridCol w:w="9360"/>
       </w:tblGrid>
       <w:tr>
-        <w:tblPrEx>
-          <w:tblCellMar>
-            <w:top w:w="0" w:type="dxa"/>
-            <w:bottom w:w="0" w:type="dxa"/>
-          </w:tblCellMar>
-        </w:tblPrEx>
         <w:tc>
           <w:tcPr>
             <w:tcW w:w="9360" w:type="dxa"/>
@@ -2858,12 +2739,6 @@
         <w:gridCol w:w="9360"/>
       </w:tblGrid>
       <w:tr>
-        <w:tblPrEx>
-          <w:tblCellMar>
-            <w:top w:w="0" w:type="dxa"/>
-            <w:bottom w:w="0" w:type="dxa"/>
-          </w:tblCellMar>
-        </w:tblPrEx>
         <w:tc>
           <w:tcPr>
             <w:tcW w:w="9360" w:type="dxa"/>
@@ -2895,6 +2770,7 @@
               <w:rPr>
                 <w:i/>
                 <w:iCs/>
+                <w:noProof/>
                 <w:sz w:val="20"/>
                 <w:szCs w:val="20"/>
               </w:rPr>
@@ -3002,12 +2878,6 @@
         <w:gridCol w:w="9360"/>
       </w:tblGrid>
       <w:tr>
-        <w:tblPrEx>
-          <w:tblCellMar>
-            <w:top w:w="0" w:type="dxa"/>
-            <w:bottom w:w="0" w:type="dxa"/>
-          </w:tblCellMar>
-        </w:tblPrEx>
         <w:tc>
           <w:tcPr>
             <w:tcW w:w="9360" w:type="dxa"/>
@@ -3029,7 +2899,6 @@
             <w:pPr>
               <w:jc w:val="center"/>
             </w:pPr>
-            <w:proofErr w:type="gramStart"/>
             <w:r>
               <w:rPr>
                 <w:rFonts w:ascii="Segoe UI Emoji" w:hAnsi="Segoe UI Emoji" w:cs="Segoe UI Emoji"/>
@@ -3043,15 +2912,7 @@
                 <w:b/>
                 <w:bCs/>
               </w:rPr>
-              <w:t xml:space="preserve">  INSERT</w:t>
-            </w:r>
-            <w:proofErr w:type="gramEnd"/>
-            <w:r>
-              <w:rPr>
-                <w:b/>
-                <w:bCs/>
-              </w:rPr>
-              <w:t xml:space="preserve"> SCREENSHOT HERE</w:t>
+              <w:t xml:space="preserve">  INSERT SCREENSHOT HERE</w:t>
             </w:r>
           </w:p>
           <w:p>
@@ -3097,12 +2958,6 @@
         <w:gridCol w:w="9360"/>
       </w:tblGrid>
       <w:tr>
-        <w:tblPrEx>
-          <w:tblCellMar>
-            <w:top w:w="0" w:type="dxa"/>
-            <w:bottom w:w="0" w:type="dxa"/>
-          </w:tblCellMar>
-        </w:tblPrEx>
         <w:tc>
           <w:tcPr>
             <w:tcW w:w="9360" w:type="dxa"/>
@@ -3134,6 +2989,7 @@
               <w:rPr>
                 <w:b/>
                 <w:bCs/>
+                <w:noProof/>
               </w:rPr>
               <w:drawing>
                 <wp:inline distT="0" distB="0" distL="0" distR="0" wp14:anchorId="27E5B0A9" wp14:editId="31B71CEF">
@@ -3228,12 +3084,6 @@
         <w:gridCol w:w="8860"/>
       </w:tblGrid>
       <w:tr>
-        <w:tblPrEx>
-          <w:tblCellMar>
-            <w:top w:w="0" w:type="dxa"/>
-            <w:bottom w:w="0" w:type="dxa"/>
-          </w:tblCellMar>
-        </w:tblPrEx>
         <w:trPr>
           <w:trHeight w:val="4060"/>
         </w:trPr>
@@ -3268,12 +3118,13 @@
               <w:rPr>
                 <w:i/>
                 <w:iCs/>
+                <w:noProof/>
                 <w:sz w:val="20"/>
                 <w:szCs w:val="20"/>
               </w:rPr>
               <w:lastRenderedPageBreak/>
               <w:drawing>
-                <wp:inline distT="0" distB="0" distL="0" distR="0" wp14:anchorId="58DDD8FC" wp14:editId="51DA256B">
+                <wp:inline distT="0" distB="0" distL="0" distR="0" wp14:anchorId="58DDD8FC" wp14:editId="3C3DA6CF">
                   <wp:extent cx="2197100" cy="2482850"/>
                   <wp:effectExtent l="0" t="0" r="0" b="0"/>
                   <wp:docPr id="990472966" name="Picture 4"/>
@@ -3376,12 +3227,6 @@
         <w:gridCol w:w="9360"/>
       </w:tblGrid>
       <w:tr>
-        <w:tblPrEx>
-          <w:tblCellMar>
-            <w:top w:w="0" w:type="dxa"/>
-            <w:bottom w:w="0" w:type="dxa"/>
-          </w:tblCellMar>
-        </w:tblPrEx>
         <w:tc>
           <w:tcPr>
             <w:tcW w:w="9360" w:type="dxa"/>
@@ -3403,7 +3248,6 @@
             <w:pPr>
               <w:jc w:val="center"/>
             </w:pPr>
-            <w:proofErr w:type="gramStart"/>
             <w:r>
               <w:rPr>
                 <w:rFonts w:ascii="Segoe UI Emoji" w:hAnsi="Segoe UI Emoji" w:cs="Segoe UI Emoji"/>
@@ -3417,15 +3261,7 @@
                 <w:b/>
                 <w:bCs/>
               </w:rPr>
-              <w:t xml:space="preserve">  INSERT</w:t>
-            </w:r>
-            <w:proofErr w:type="gramEnd"/>
-            <w:r>
-              <w:rPr>
-                <w:b/>
-                <w:bCs/>
-              </w:rPr>
-              <w:t xml:space="preserve"> SCREENSHOT HERE</w:t>
+              <w:t xml:space="preserve">  INSERT SCREENSHOT HERE</w:t>
             </w:r>
           </w:p>
           <w:p>
@@ -3471,12 +3307,6 @@
         <w:gridCol w:w="9360"/>
       </w:tblGrid>
       <w:tr>
-        <w:tblPrEx>
-          <w:tblCellMar>
-            <w:top w:w="0" w:type="dxa"/>
-            <w:bottom w:w="0" w:type="dxa"/>
-          </w:tblCellMar>
-        </w:tblPrEx>
         <w:tc>
           <w:tcPr>
             <w:tcW w:w="9360" w:type="dxa"/>
@@ -3508,6 +3338,7 @@
               <w:rPr>
                 <w:i/>
                 <w:iCs/>
+                <w:noProof/>
                 <w:sz w:val="20"/>
                 <w:szCs w:val="20"/>
               </w:rPr>
@@ -3583,21 +3414,8 @@
                 <w:sz w:val="20"/>
                 <w:szCs w:val="20"/>
               </w:rPr>
-              <w:t xml:space="preserve">Screenshot 7: Android Studio showing DukaStock project structure and </w:t>
-            </w:r>
-            <w:proofErr w:type="spellStart"/>
-            <w:proofErr w:type="gramStart"/>
-            <w:r>
-              <w:rPr>
-                <w:i/>
-                <w:iCs/>
-                <w:sz w:val="20"/>
-                <w:szCs w:val="20"/>
-              </w:rPr>
-              <w:t>main.dart</w:t>
-            </w:r>
-            <w:proofErr w:type="spellEnd"/>
-            <w:proofErr w:type="gramEnd"/>
+              <w:t>Screenshot 7: Android Studio showing DukaStock project structure and main.dart</w:t>
+            </w:r>
           </w:p>
         </w:tc>
       </w:tr>
@@ -3628,12 +3446,6 @@
         <w:gridCol w:w="9360"/>
       </w:tblGrid>
       <w:tr>
-        <w:tblPrEx>
-          <w:tblCellMar>
-            <w:top w:w="0" w:type="dxa"/>
-            <w:bottom w:w="0" w:type="dxa"/>
-          </w:tblCellMar>
-        </w:tblPrEx>
         <w:tc>
           <w:tcPr>
             <w:tcW w:w="9360" w:type="dxa"/>
@@ -3663,6 +3475,7 @@
               <w:rPr>
                 <w:b/>
                 <w:bCs/>
+                <w:noProof/>
               </w:rPr>
               <w:lastRenderedPageBreak/>
               <w:drawing>
@@ -3780,12 +3593,6 @@
         <w:gridCol w:w="9360"/>
       </w:tblGrid>
       <w:tr>
-        <w:tblPrEx>
-          <w:tblCellMar>
-            <w:top w:w="0" w:type="dxa"/>
-            <w:bottom w:w="0" w:type="dxa"/>
-          </w:tblCellMar>
-        </w:tblPrEx>
         <w:tc>
           <w:tcPr>
             <w:tcW w:w="9360" w:type="dxa"/>
@@ -3805,6 +3612,9 @@
           </w:tcPr>
           <w:p>
             <w:r>
+              <w:rPr>
+                <w:noProof/>
+              </w:rPr>
               <w:drawing>
                 <wp:inline distT="0" distB="0" distL="0" distR="0" wp14:anchorId="7DBC63A2" wp14:editId="3F472FF8">
                   <wp:extent cx="4446759" cy="2279650"/>
@@ -3867,29 +3677,7 @@
                 <w:sz w:val="20"/>
                 <w:szCs w:val="20"/>
               </w:rPr>
-              <w:t xml:space="preserve">Screenshot 9: Customized </w:t>
-            </w:r>
-            <w:proofErr w:type="spellStart"/>
-            <w:proofErr w:type="gramStart"/>
-            <w:r>
-              <w:rPr>
-                <w:i/>
-                <w:iCs/>
-                <w:sz w:val="20"/>
-                <w:szCs w:val="20"/>
-              </w:rPr>
-              <w:t>main.dart</w:t>
-            </w:r>
-            <w:proofErr w:type="spellEnd"/>
-            <w:proofErr w:type="gramEnd"/>
-            <w:r>
-              <w:rPr>
-                <w:i/>
-                <w:iCs/>
-                <w:sz w:val="20"/>
-                <w:szCs w:val="20"/>
-              </w:rPr>
-              <w:t xml:space="preserve"> code in Android Studio</w:t>
+              <w:t>Screenshot 9: Customized main.dart code in Android Studio</w:t>
             </w:r>
           </w:p>
         </w:tc>
@@ -3921,12 +3709,6 @@
         <w:gridCol w:w="9360"/>
       </w:tblGrid>
       <w:tr>
-        <w:tblPrEx>
-          <w:tblCellMar>
-            <w:top w:w="0" w:type="dxa"/>
-            <w:bottom w:w="0" w:type="dxa"/>
-          </w:tblCellMar>
-        </w:tblPrEx>
         <w:tc>
           <w:tcPr>
             <w:tcW w:w="9360" w:type="dxa"/>
@@ -3956,6 +3738,7 @@
               <w:rPr>
                 <w:b/>
                 <w:bCs/>
+                <w:noProof/>
               </w:rPr>
               <w:lastRenderedPageBreak/>
               <w:drawing>
@@ -4061,12 +3844,6 @@
         <w:gridCol w:w="9001"/>
       </w:tblGrid>
       <w:tr>
-        <w:tblPrEx>
-          <w:tblCellMar>
-            <w:top w:w="0" w:type="dxa"/>
-            <w:bottom w:w="0" w:type="dxa"/>
-          </w:tblCellMar>
-        </w:tblPrEx>
         <w:tc>
           <w:tcPr>
             <w:tcW w:w="9001" w:type="dxa"/>
@@ -4120,13 +3897,14 @@
                 <w:bCs/>
                 <w:i/>
                 <w:iCs/>
+                <w:noProof/>
                 <w:sz w:val="20"/>
                 <w:szCs w:val="20"/>
               </w:rPr>
               <w:drawing>
-                <wp:inline distT="0" distB="0" distL="0" distR="0" wp14:anchorId="0AD1E5A6" wp14:editId="3163C0F6">
-                  <wp:extent cx="3168650" cy="2057059"/>
-                  <wp:effectExtent l="0" t="0" r="0" b="635"/>
+                <wp:inline distT="0" distB="0" distL="0" distR="0" wp14:anchorId="0AD1E5A6" wp14:editId="09311D4C">
+                  <wp:extent cx="2807263" cy="1822450"/>
+                  <wp:effectExtent l="0" t="0" r="0" b="6350"/>
                   <wp:docPr id="2111052516" name="Picture 14"/>
                   <wp:cNvGraphicFramePr>
                     <a:graphicFrameLocks xmlns:a="http://schemas.openxmlformats.org/drawingml/2006/main" noChangeAspect="1"/>
@@ -4141,7 +3919,7 @@
                           </pic:cNvPicPr>
                         </pic:nvPicPr>
                         <pic:blipFill>
-                          <a:blip r:embed="rId13">
+                          <a:blip r:embed="rId13" cstate="print">
                             <a:extLst>
                               <a:ext uri="{28A0092B-C50C-407E-A947-70E740481C1C}">
                                 <a14:useLocalDpi xmlns:a14="http://schemas.microsoft.com/office/drawing/2010/main" val="0"/>
@@ -4156,7 +3934,7 @@
                         <pic:spPr bwMode="auto">
                           <a:xfrm>
                             <a:off x="0" y="0"/>
-                            <a:ext cx="3188658" cy="2070048"/>
+                            <a:ext cx="2827507" cy="1835592"/>
                           </a:xfrm>
                           <a:prstGeom prst="rect">
                             <a:avLst/>
@@ -4364,7 +4142,6 @@
           <w:sz w:val="26"/>
           <w:szCs w:val="26"/>
         </w:rPr>
-        <w:lastRenderedPageBreak/>
         <w:t>Personal Reflection</w:t>
       </w:r>
       <w:bookmarkEnd w:id="6"/>
@@ -4380,25 +4157,8 @@
           <w:i/>
           <w:iCs/>
         </w:rPr>
-        <w:t xml:space="preserve">This week I set up the full Flutter development environment from scratch. The biggest challenge was configuring the Flutter SDK path and resolving Gradle build errors caused by syntax mistakes in </w:t>
-      </w:r>
-      <w:proofErr w:type="spellStart"/>
-      <w:proofErr w:type="gramStart"/>
-      <w:r>
-        <w:rPr>
-          <w:i/>
-          <w:iCs/>
-        </w:rPr>
-        <w:t>main.dart</w:t>
-      </w:r>
-      <w:proofErr w:type="spellEnd"/>
-      <w:proofErr w:type="gramEnd"/>
-      <w:r>
-        <w:rPr>
-          <w:i/>
-          <w:iCs/>
-        </w:rPr>
-        <w:t>. I learned that CLI tools are more reliable than GUI wizards for precise project setup</w:t>
+        <w:lastRenderedPageBreak/>
+        <w:t>This week I set up the full Flutter development environment from scratch. The biggest challenge was configuring the Flutter SDK path and resolving Gradle build errors caused by syntax mistakes in main.dart. I learned that CLI tools are more reliable than GUI wizards for precise project setup</w:t>
       </w:r>
       <w:r>
         <w:br w:type="page"/>
@@ -4471,15 +4231,7 @@
         <w:contextualSpacing w:val="0"/>
       </w:pPr>
       <w:r>
-        <w:t>Created Firebase project '</w:t>
-      </w:r>
-      <w:proofErr w:type="spellStart"/>
-      <w:r>
-        <w:t>dukastock</w:t>
-      </w:r>
-      <w:proofErr w:type="spellEnd"/>
-      <w:r>
-        <w:t>' on the free Spark plan at console.firebase.google.com</w:t>
+        <w:t>Created Firebase project 'dukastock' on the free Spark plan at console.firebase.google.com</w:t>
       </w:r>
     </w:p>
     <w:p>
@@ -4507,15 +4259,7 @@
         <w:contextualSpacing w:val="0"/>
       </w:pPr>
       <w:r>
-        <w:t xml:space="preserve">Created Cloud </w:t>
-      </w:r>
-      <w:proofErr w:type="spellStart"/>
-      <w:r>
-        <w:t>Firestore</w:t>
-      </w:r>
-      <w:proofErr w:type="spellEnd"/>
-      <w:r>
-        <w:t xml:space="preserve"> database in Standard edition with test mode security rules, location: europe-west1</w:t>
+        <w:t>Created Cloud Firestore database in Standard edition with test mode security rules, location: europe-west1</w:t>
       </w:r>
     </w:p>
     <w:p>
@@ -4529,23 +4273,8 @@
         <w:contextualSpacing w:val="0"/>
       </w:pPr>
       <w:r>
-        <w:t xml:space="preserve">Registered DukaStock Android app in Firebase with package name </w:t>
-      </w:r>
-      <w:proofErr w:type="spellStart"/>
-      <w:proofErr w:type="gramStart"/>
-      <w:r>
-        <w:t>com.jokacoded</w:t>
-      </w:r>
-      <w:proofErr w:type="gramEnd"/>
-      <w:r>
-        <w:t>.</w:t>
-      </w:r>
-      <w:proofErr w:type="gramStart"/>
-      <w:r>
-        <w:t>dukastock.dukastock</w:t>
-      </w:r>
-      <w:proofErr w:type="spellEnd"/>
-      <w:proofErr w:type="gramEnd"/>
+        <w:t>Registered DukaStock Android app in Firebase with package name com.jokacoded.dukastock.dukastock</w:t>
+      </w:r>
     </w:p>
     <w:p>
       <w:pPr>
@@ -4558,17 +4287,7 @@
         <w:contextualSpacing w:val="0"/>
       </w:pPr>
       <w:r>
-        <w:t>Downloaded google-</w:t>
-      </w:r>
-      <w:proofErr w:type="spellStart"/>
-      <w:proofErr w:type="gramStart"/>
-      <w:r>
-        <w:t>services.json</w:t>
-      </w:r>
-      <w:proofErr w:type="spellEnd"/>
-      <w:proofErr w:type="gramEnd"/>
-      <w:r>
-        <w:t xml:space="preserve"> and placed it in android/app/ folder of the Flutter project</w:t>
+        <w:t>Downloaded google-services.json and placed it in android/app/ folder of the Flutter project</w:t>
       </w:r>
     </w:p>
     <w:p>
@@ -4582,31 +4301,7 @@
         <w:contextualSpacing w:val="0"/>
       </w:pPr>
       <w:r>
-        <w:t xml:space="preserve">Added Firebase packages: </w:t>
-      </w:r>
-      <w:proofErr w:type="spellStart"/>
-      <w:r>
-        <w:t>firebase_core</w:t>
-      </w:r>
-      <w:proofErr w:type="spellEnd"/>
-      <w:r>
-        <w:t xml:space="preserve">, </w:t>
-      </w:r>
-      <w:proofErr w:type="spellStart"/>
-      <w:r>
-        <w:t>firebase_auth</w:t>
-      </w:r>
-      <w:proofErr w:type="spellEnd"/>
-      <w:r>
-        <w:t xml:space="preserve">, </w:t>
-      </w:r>
-      <w:proofErr w:type="spellStart"/>
-      <w:r>
-        <w:t>cloud_firestore</w:t>
-      </w:r>
-      <w:proofErr w:type="spellEnd"/>
-      <w:r>
-        <w:t xml:space="preserve"> using flutter pub add</w:t>
+        <w:t>Added Firebase packages: firebase_core, firebase_auth, cloud_firestore using flutter pub add</w:t>
       </w:r>
     </w:p>
     <w:p>
@@ -4620,15 +4315,7 @@
         <w:contextualSpacing w:val="0"/>
       </w:pPr>
       <w:r>
-        <w:t xml:space="preserve">Configured project-level and app-level </w:t>
-      </w:r>
-      <w:proofErr w:type="spellStart"/>
-      <w:r>
-        <w:t>build.gradle.kts</w:t>
-      </w:r>
-      <w:proofErr w:type="spellEnd"/>
-      <w:r>
-        <w:t xml:space="preserve"> files with Google Services plugin</w:t>
+        <w:t>Configured project-level and app-level build.gradle.kts files with Google Services plugin</w:t>
       </w:r>
     </w:p>
     <w:p>
@@ -4670,15 +4357,7 @@
         <w:contextualSpacing w:val="0"/>
       </w:pPr>
       <w:r>
-        <w:t xml:space="preserve">Built role-based Dashboard showing different menus for Retailers and Wholesalers based on </w:t>
-      </w:r>
-      <w:proofErr w:type="spellStart"/>
-      <w:r>
-        <w:t>Firestore</w:t>
-      </w:r>
-      <w:proofErr w:type="spellEnd"/>
-      <w:r>
-        <w:t xml:space="preserve"> role field</w:t>
+        <w:t>Built role-based Dashboard showing different menus for Retailers and Wholesalers based on Firestore role field</w:t>
       </w:r>
     </w:p>
     <w:p>
@@ -4720,15 +4399,7 @@
         <w:contextualSpacing w:val="0"/>
       </w:pPr>
       <w:r>
-        <w:t xml:space="preserve">Verified user data saved correctly in </w:t>
-      </w:r>
-      <w:proofErr w:type="spellStart"/>
-      <w:r>
-        <w:t>Firestore</w:t>
-      </w:r>
-      <w:proofErr w:type="spellEnd"/>
-      <w:r>
-        <w:t xml:space="preserve"> users collection with name, email, role, and timestamp</w:t>
+        <w:t>Verified user data saved correctly in Firestore users collection with name, email, role, and timestamp</w:t>
       </w:r>
     </w:p>
     <w:p>
@@ -4788,6 +4459,116 @@
         <w:t>Screenshots Attached: Yes</w:t>
       </w:r>
     </w:p>
+    <w:p>
+      <w:pPr>
+        <w:spacing w:before="100" w:after="100"/>
+      </w:pPr>
+    </w:p>
+    <w:tbl>
+      <w:tblPr>
+        <w:tblW w:w="8930" w:type="dxa"/>
+        <w:tblBorders>
+          <w:top w:val="single" w:sz="4" w:space="0" w:color="auto"/>
+          <w:left w:val="single" w:sz="4" w:space="0" w:color="auto"/>
+          <w:bottom w:val="single" w:sz="4" w:space="0" w:color="auto"/>
+          <w:right w:val="single" w:sz="4" w:space="0" w:color="auto"/>
+          <w:insideH w:val="single" w:sz="4" w:space="0" w:color="auto"/>
+          <w:insideV w:val="single" w:sz="4" w:space="0" w:color="auto"/>
+        </w:tblBorders>
+        <w:tblCellMar>
+          <w:left w:w="10" w:type="dxa"/>
+          <w:right w:w="10" w:type="dxa"/>
+        </w:tblCellMar>
+        <w:tblLook w:val="0000" w:firstRow="0" w:lastRow="0" w:firstColumn="0" w:lastColumn="0" w:noHBand="0" w:noVBand="0"/>
+      </w:tblPr>
+      <w:tblGrid>
+        <w:gridCol w:w="8930"/>
+      </w:tblGrid>
+      <w:tr>
+        <w:trPr>
+          <w:trHeight w:val="745"/>
+        </w:trPr>
+        <w:tc>
+          <w:tcPr>
+            <w:tcW w:w="8930" w:type="dxa"/>
+            <w:tcBorders>
+              <w:top w:val="dashed" w:sz="2" w:space="0" w:color="2E7D32"/>
+              <w:left w:val="dashed" w:sz="2" w:space="0" w:color="2E7D32"/>
+              <w:bottom w:val="dashed" w:sz="2" w:space="0" w:color="2E7D32"/>
+              <w:right w:val="dashed" w:sz="2" w:space="0" w:color="2E7D32"/>
+            </w:tcBorders>
+            <w:shd w:val="clear" w:color="auto" w:fill="F1F8E9"/>
+            <w:tcMar>
+              <w:top w:w="220" w:type="dxa"/>
+              <w:left w:w="200" w:type="dxa"/>
+              <w:bottom w:w="220" w:type="dxa"/>
+              <w:right w:w="200" w:type="dxa"/>
+            </w:tcMar>
+          </w:tcPr>
+          <w:p>
+            <w:pPr>
+              <w:jc w:val="center"/>
+            </w:pPr>
+            <w:r>
+              <w:lastRenderedPageBreak/>
+              <w:drawing>
+                <wp:inline distT="0" distB="0" distL="0" distR="0" wp14:anchorId="56494608" wp14:editId="1209488E">
+                  <wp:extent cx="4273550" cy="2724012"/>
+                  <wp:effectExtent l="0" t="0" r="0" b="635"/>
+                  <wp:docPr id="601316862" name="Picture 2"/>
+                  <wp:cNvGraphicFramePr>
+                    <a:graphicFrameLocks xmlns:a="http://schemas.openxmlformats.org/drawingml/2006/main" noChangeAspect="1"/>
+                  </wp:cNvGraphicFramePr>
+                  <a:graphic xmlns:a="http://schemas.openxmlformats.org/drawingml/2006/main">
+                    <a:graphicData uri="http://schemas.openxmlformats.org/drawingml/2006/picture">
+                      <pic:pic xmlns:pic="http://schemas.openxmlformats.org/drawingml/2006/picture">
+                        <pic:nvPicPr>
+                          <pic:cNvPr id="0" name="Picture 6"/>
+                          <pic:cNvPicPr>
+                            <a:picLocks noChangeAspect="1" noChangeArrowheads="1"/>
+                          </pic:cNvPicPr>
+                        </pic:nvPicPr>
+                        <pic:blipFill>
+                          <a:blip r:embed="rId14" cstate="print">
+                            <a:extLst>
+                              <a:ext uri="{28A0092B-C50C-407E-A947-70E740481C1C}">
+                                <a14:useLocalDpi xmlns:a14="http://schemas.microsoft.com/office/drawing/2010/main" val="0"/>
+                              </a:ext>
+                            </a:extLst>
+                          </a:blip>
+                          <a:srcRect/>
+                          <a:stretch>
+                            <a:fillRect/>
+                          </a:stretch>
+                        </pic:blipFill>
+                        <pic:spPr bwMode="auto">
+                          <a:xfrm>
+                            <a:off x="0" y="0"/>
+                            <a:ext cx="4281953" cy="2729368"/>
+                          </a:xfrm>
+                          <a:prstGeom prst="rect">
+                            <a:avLst/>
+                          </a:prstGeom>
+                          <a:noFill/>
+                          <a:ln>
+                            <a:noFill/>
+                          </a:ln>
+                        </pic:spPr>
+                      </pic:pic>
+                    </a:graphicData>
+                  </a:graphic>
+                </wp:inline>
+              </w:drawing>
+            </w:r>
+          </w:p>
+          <w:p>
+            <w:pPr>
+              <w:jc w:val="center"/>
+            </w:pPr>
+          </w:p>
+        </w:tc>
+      </w:tr>
+    </w:tbl>
     <w:p>
       <w:pPr>
         <w:spacing w:before="100" w:after="100"/>
@@ -4814,12 +4595,6 @@
         <w:gridCol w:w="9360"/>
       </w:tblGrid>
       <w:tr>
-        <w:tblPrEx>
-          <w:tblCellMar>
-            <w:top w:w="0" w:type="dxa"/>
-            <w:bottom w:w="0" w:type="dxa"/>
-          </w:tblCellMar>
-        </w:tblPrEx>
         <w:tc>
           <w:tcPr>
             <w:tcW w:w="9360" w:type="dxa"/>
@@ -4841,64 +4616,61 @@
             <w:pPr>
               <w:jc w:val="center"/>
             </w:pPr>
-            <w:proofErr w:type="gramStart"/>
-            <w:r>
-              <w:rPr>
-                <w:rFonts w:ascii="Segoe UI Emoji" w:hAnsi="Segoe UI Emoji" w:cs="Segoe UI Emoji"/>
-                <w:b/>
-                <w:bCs/>
-              </w:rPr>
-              <w:t>📸</w:t>
-            </w:r>
-            <w:r>
-              <w:rPr>
-                <w:b/>
-                <w:bCs/>
-              </w:rPr>
-              <w:t xml:space="preserve">  INSERT</w:t>
-            </w:r>
-            <w:proofErr w:type="gramEnd"/>
-            <w:r>
-              <w:rPr>
-                <w:b/>
-                <w:bCs/>
-              </w:rPr>
-              <w:t xml:space="preserve"> SCREENSHOT HERE</w:t>
+            <w:r>
+              <w:drawing>
+                <wp:inline distT="0" distB="0" distL="0" distR="0" wp14:anchorId="4F4CA832" wp14:editId="3DC7F488">
+                  <wp:extent cx="4197350" cy="1195405"/>
+                  <wp:effectExtent l="0" t="0" r="0" b="5080"/>
+                  <wp:docPr id="1076486229" name="Picture 4"/>
+                  <wp:cNvGraphicFramePr>
+                    <a:graphicFrameLocks xmlns:a="http://schemas.openxmlformats.org/drawingml/2006/main" noChangeAspect="1"/>
+                  </wp:cNvGraphicFramePr>
+                  <a:graphic xmlns:a="http://schemas.openxmlformats.org/drawingml/2006/main">
+                    <a:graphicData uri="http://schemas.openxmlformats.org/drawingml/2006/picture">
+                      <pic:pic xmlns:pic="http://schemas.openxmlformats.org/drawingml/2006/picture">
+                        <pic:nvPicPr>
+                          <pic:cNvPr id="0" name="Picture 13"/>
+                          <pic:cNvPicPr>
+                            <a:picLocks noChangeAspect="1" noChangeArrowheads="1"/>
+                          </pic:cNvPicPr>
+                        </pic:nvPicPr>
+                        <pic:blipFill>
+                          <a:blip r:embed="rId15">
+                            <a:extLst>
+                              <a:ext uri="{28A0092B-C50C-407E-A947-70E740481C1C}">
+                                <a14:useLocalDpi xmlns:a14="http://schemas.microsoft.com/office/drawing/2010/main" val="0"/>
+                              </a:ext>
+                            </a:extLst>
+                          </a:blip>
+                          <a:srcRect/>
+                          <a:stretch>
+                            <a:fillRect/>
+                          </a:stretch>
+                        </pic:blipFill>
+                        <pic:spPr bwMode="auto">
+                          <a:xfrm>
+                            <a:off x="0" y="0"/>
+                            <a:ext cx="4201839" cy="1196683"/>
+                          </a:xfrm>
+                          <a:prstGeom prst="rect">
+                            <a:avLst/>
+                          </a:prstGeom>
+                          <a:noFill/>
+                          <a:ln>
+                            <a:noFill/>
+                          </a:ln>
+                        </pic:spPr>
+                      </pic:pic>
+                    </a:graphicData>
+                  </a:graphic>
+                </wp:inline>
+              </w:drawing>
             </w:r>
           </w:p>
           <w:p>
             <w:pPr>
               <w:jc w:val="center"/>
             </w:pPr>
-            <w:r>
-              <w:rPr>
-                <w:i/>
-                <w:iCs/>
-                <w:sz w:val="20"/>
-                <w:szCs w:val="20"/>
-              </w:rPr>
-              <w:t xml:space="preserve">Screenshot 12: Firebase console showing </w:t>
-            </w:r>
-            <w:proofErr w:type="spellStart"/>
-            <w:r>
-              <w:rPr>
-                <w:i/>
-                <w:iCs/>
-                <w:sz w:val="20"/>
-                <w:szCs w:val="20"/>
-              </w:rPr>
-              <w:t>dukastock</w:t>
-            </w:r>
-            <w:proofErr w:type="spellEnd"/>
-            <w:r>
-              <w:rPr>
-                <w:i/>
-                <w:iCs/>
-                <w:sz w:val="20"/>
-                <w:szCs w:val="20"/>
-              </w:rPr>
-              <w:t xml:space="preserve"> project dashboard</w:t>
-            </w:r>
           </w:p>
         </w:tc>
       </w:tr>
@@ -4929,12 +4701,6 @@
         <w:gridCol w:w="9360"/>
       </w:tblGrid>
       <w:tr>
-        <w:tblPrEx>
-          <w:tblCellMar>
-            <w:top w:w="0" w:type="dxa"/>
-            <w:bottom w:w="0" w:type="dxa"/>
-          </w:tblCellMar>
-        </w:tblPrEx>
         <w:tc>
           <w:tcPr>
             <w:tcW w:w="9360" w:type="dxa"/>
@@ -4956,45 +4722,61 @@
             <w:pPr>
               <w:jc w:val="center"/>
             </w:pPr>
-            <w:proofErr w:type="gramStart"/>
-            <w:r>
-              <w:rPr>
-                <w:rFonts w:ascii="Segoe UI Emoji" w:hAnsi="Segoe UI Emoji" w:cs="Segoe UI Emoji"/>
-                <w:b/>
-                <w:bCs/>
-              </w:rPr>
-              <w:lastRenderedPageBreak/>
-              <w:t>📸</w:t>
-            </w:r>
-            <w:r>
-              <w:rPr>
-                <w:b/>
-                <w:bCs/>
-              </w:rPr>
-              <w:t xml:space="preserve">  INSERT</w:t>
-            </w:r>
-            <w:proofErr w:type="gramEnd"/>
-            <w:r>
-              <w:rPr>
-                <w:b/>
-                <w:bCs/>
-              </w:rPr>
-              <w:t xml:space="preserve"> SCREENSHOT HERE</w:t>
+            <w:r>
+              <w:drawing>
+                <wp:inline distT="0" distB="0" distL="0" distR="0" wp14:anchorId="1DC2C698" wp14:editId="005D300E">
+                  <wp:extent cx="4291457" cy="1987550"/>
+                  <wp:effectExtent l="0" t="0" r="0" b="0"/>
+                  <wp:docPr id="509560865" name="Picture 6"/>
+                  <wp:cNvGraphicFramePr>
+                    <a:graphicFrameLocks xmlns:a="http://schemas.openxmlformats.org/drawingml/2006/main" noChangeAspect="1"/>
+                  </wp:cNvGraphicFramePr>
+                  <a:graphic xmlns:a="http://schemas.openxmlformats.org/drawingml/2006/main">
+                    <a:graphicData uri="http://schemas.openxmlformats.org/drawingml/2006/picture">
+                      <pic:pic xmlns:pic="http://schemas.openxmlformats.org/drawingml/2006/picture">
+                        <pic:nvPicPr>
+                          <pic:cNvPr id="0" name="Picture 20"/>
+                          <pic:cNvPicPr>
+                            <a:picLocks noChangeAspect="1" noChangeArrowheads="1"/>
+                          </pic:cNvPicPr>
+                        </pic:nvPicPr>
+                        <pic:blipFill>
+                          <a:blip r:embed="rId16" cstate="print">
+                            <a:extLst>
+                              <a:ext uri="{28A0092B-C50C-407E-A947-70E740481C1C}">
+                                <a14:useLocalDpi xmlns:a14="http://schemas.microsoft.com/office/drawing/2010/main" val="0"/>
+                              </a:ext>
+                            </a:extLst>
+                          </a:blip>
+                          <a:srcRect/>
+                          <a:stretch>
+                            <a:fillRect/>
+                          </a:stretch>
+                        </pic:blipFill>
+                        <pic:spPr bwMode="auto">
+                          <a:xfrm>
+                            <a:off x="0" y="0"/>
+                            <a:ext cx="4296693" cy="1989975"/>
+                          </a:xfrm>
+                          <a:prstGeom prst="rect">
+                            <a:avLst/>
+                          </a:prstGeom>
+                          <a:noFill/>
+                          <a:ln>
+                            <a:noFill/>
+                          </a:ln>
+                        </pic:spPr>
+                      </pic:pic>
+                    </a:graphicData>
+                  </a:graphic>
+                </wp:inline>
+              </w:drawing>
             </w:r>
           </w:p>
           <w:p>
             <w:pPr>
               <w:jc w:val="center"/>
             </w:pPr>
-            <w:r>
-              <w:rPr>
-                <w:i/>
-                <w:iCs/>
-                <w:sz w:val="20"/>
-                <w:szCs w:val="20"/>
-              </w:rPr>
-              <w:t>Screenshot 13: Firebase Authentication showing Email/Password provider enabled</w:t>
-            </w:r>
           </w:p>
         </w:tc>
       </w:tr>
@@ -5025,12 +4807,6 @@
         <w:gridCol w:w="9360"/>
       </w:tblGrid>
       <w:tr>
-        <w:tblPrEx>
-          <w:tblCellMar>
-            <w:top w:w="0" w:type="dxa"/>
-            <w:bottom w:w="0" w:type="dxa"/>
-          </w:tblCellMar>
-        </w:tblPrEx>
         <w:tc>
           <w:tcPr>
             <w:tcW w:w="9360" w:type="dxa"/>
@@ -5051,46 +4827,13 @@
           <w:p>
             <w:pPr>
               <w:jc w:val="center"/>
-            </w:pPr>
-            <w:proofErr w:type="gramStart"/>
-            <w:r>
-              <w:rPr>
-                <w:rFonts w:ascii="Segoe UI Emoji" w:hAnsi="Segoe UI Emoji" w:cs="Segoe UI Emoji"/>
-                <w:b/>
-                <w:bCs/>
-              </w:rPr>
-              <w:t>📸</w:t>
-            </w:r>
-            <w:r>
-              <w:rPr>
-                <w:b/>
-                <w:bCs/>
-              </w:rPr>
-              <w:t xml:space="preserve">  INSERT</w:t>
-            </w:r>
-            <w:proofErr w:type="gramEnd"/>
-            <w:r>
-              <w:rPr>
-                <w:b/>
-                <w:bCs/>
-              </w:rPr>
-              <w:t xml:space="preserve"> SCREENSHOT HERE</w:t>
-            </w:r>
-          </w:p>
-          <w:p>
-            <w:pPr>
-              <w:jc w:val="center"/>
-            </w:pPr>
-            <w:r>
               <w:rPr>
                 <w:i/>
                 <w:iCs/>
                 <w:sz w:val="20"/>
                 <w:szCs w:val="20"/>
               </w:rPr>
-              <w:t xml:space="preserve">Screenshot 14: </w:t>
-            </w:r>
-            <w:proofErr w:type="spellStart"/>
+            </w:pPr>
             <w:r>
               <w:rPr>
                 <w:i/>
@@ -5098,17 +4841,80 @@
                 <w:sz w:val="20"/>
                 <w:szCs w:val="20"/>
               </w:rPr>
-              <w:t>Firestore</w:t>
-            </w:r>
-            <w:proofErr w:type="spellEnd"/>
-            <w:r>
+              <w:lastRenderedPageBreak/>
+              <w:drawing>
+                <wp:inline distT="0" distB="0" distL="0" distR="0" wp14:anchorId="3BE2D90E" wp14:editId="0AD74ACC">
+                  <wp:extent cx="4222750" cy="2515482"/>
+                  <wp:effectExtent l="0" t="0" r="6350" b="0"/>
+                  <wp:docPr id="1510943313" name="Picture 8"/>
+                  <wp:cNvGraphicFramePr>
+                    <a:graphicFrameLocks xmlns:a="http://schemas.openxmlformats.org/drawingml/2006/main" noChangeAspect="1"/>
+                  </wp:cNvGraphicFramePr>
+                  <a:graphic xmlns:a="http://schemas.openxmlformats.org/drawingml/2006/main">
+                    <a:graphicData uri="http://schemas.openxmlformats.org/drawingml/2006/picture">
+                      <pic:pic xmlns:pic="http://schemas.openxmlformats.org/drawingml/2006/picture">
+                        <pic:nvPicPr>
+                          <pic:cNvPr id="0" name="Picture 27"/>
+                          <pic:cNvPicPr>
+                            <a:picLocks noChangeAspect="1" noChangeArrowheads="1"/>
+                          </pic:cNvPicPr>
+                        </pic:nvPicPr>
+                        <pic:blipFill>
+                          <a:blip r:embed="rId17" cstate="print">
+                            <a:extLst>
+                              <a:ext uri="{28A0092B-C50C-407E-A947-70E740481C1C}">
+                                <a14:useLocalDpi xmlns:a14="http://schemas.microsoft.com/office/drawing/2010/main" val="0"/>
+                              </a:ext>
+                            </a:extLst>
+                          </a:blip>
+                          <a:srcRect/>
+                          <a:stretch>
+                            <a:fillRect/>
+                          </a:stretch>
+                        </pic:blipFill>
+                        <pic:spPr bwMode="auto">
+                          <a:xfrm>
+                            <a:off x="0" y="0"/>
+                            <a:ext cx="4228206" cy="2518732"/>
+                          </a:xfrm>
+                          <a:prstGeom prst="rect">
+                            <a:avLst/>
+                          </a:prstGeom>
+                          <a:noFill/>
+                          <a:ln>
+                            <a:noFill/>
+                          </a:ln>
+                        </pic:spPr>
+                      </pic:pic>
+                    </a:graphicData>
+                  </a:graphic>
+                </wp:inline>
+              </w:drawing>
+            </w:r>
+          </w:p>
+          <w:p>
+            <w:pPr>
+              <w:jc w:val="center"/>
               <w:rPr>
                 <w:i/>
                 <w:iCs/>
                 <w:sz w:val="20"/>
                 <w:szCs w:val="20"/>
               </w:rPr>
-              <w:t xml:space="preserve"> Database showing empty (default) database ready</w:t>
+            </w:pPr>
+          </w:p>
+          <w:p>
+            <w:pPr>
+              <w:jc w:val="center"/>
+            </w:pPr>
+            <w:r>
+              <w:rPr>
+                <w:i/>
+                <w:iCs/>
+                <w:sz w:val="20"/>
+                <w:szCs w:val="20"/>
+              </w:rPr>
+              <w:t>Screenshot 15: Firebase Project Settings showing DukaStock Android app registered</w:t>
             </w:r>
           </w:p>
         </w:tc>
@@ -5140,12 +4946,6 @@
         <w:gridCol w:w="9360"/>
       </w:tblGrid>
       <w:tr>
-        <w:tblPrEx>
-          <w:tblCellMar>
-            <w:top w:w="0" w:type="dxa"/>
-            <w:bottom w:w="0" w:type="dxa"/>
-          </w:tblCellMar>
-        </w:tblPrEx>
         <w:tc>
           <w:tcPr>
             <w:tcW w:w="9360" w:type="dxa"/>
@@ -5164,34 +4964,58 @@
             </w:tcMar>
           </w:tcPr>
           <w:p>
-            <w:pPr>
-              <w:jc w:val="center"/>
-            </w:pPr>
-            <w:proofErr w:type="gramStart"/>
-            <w:r>
-              <w:rPr>
-                <w:rFonts w:ascii="Segoe UI Emoji" w:hAnsi="Segoe UI Emoji" w:cs="Segoe UI Emoji"/>
-                <w:b/>
-                <w:bCs/>
-              </w:rPr>
-              <w:t>📸</w:t>
-            </w:r>
-            <w:r>
-              <w:rPr>
-                <w:b/>
-                <w:bCs/>
-              </w:rPr>
-              <w:t xml:space="preserve">  INSERT</w:t>
-            </w:r>
-            <w:proofErr w:type="gramEnd"/>
-            <w:r>
-              <w:rPr>
-                <w:b/>
-                <w:bCs/>
-              </w:rPr>
-              <w:t xml:space="preserve"> SCREENSHOT HERE</w:t>
-            </w:r>
-          </w:p>
+            <w:r>
+              <w:drawing>
+                <wp:inline distT="0" distB="0" distL="0" distR="0" wp14:anchorId="11016A15" wp14:editId="2113ACC2">
+                  <wp:extent cx="3498850" cy="2768428"/>
+                  <wp:effectExtent l="0" t="0" r="6350" b="0"/>
+                  <wp:docPr id="824695433" name="Picture 10"/>
+                  <wp:cNvGraphicFramePr>
+                    <a:graphicFrameLocks xmlns:a="http://schemas.openxmlformats.org/drawingml/2006/main" noChangeAspect="1"/>
+                  </wp:cNvGraphicFramePr>
+                  <a:graphic xmlns:a="http://schemas.openxmlformats.org/drawingml/2006/main">
+                    <a:graphicData uri="http://schemas.openxmlformats.org/drawingml/2006/picture">
+                      <pic:pic xmlns:pic="http://schemas.openxmlformats.org/drawingml/2006/picture">
+                        <pic:nvPicPr>
+                          <pic:cNvPr id="0" name="Picture 34"/>
+                          <pic:cNvPicPr>
+                            <a:picLocks noChangeAspect="1" noChangeArrowheads="1"/>
+                          </pic:cNvPicPr>
+                        </pic:nvPicPr>
+                        <pic:blipFill>
+                          <a:blip r:embed="rId18" cstate="print">
+                            <a:extLst>
+                              <a:ext uri="{28A0092B-C50C-407E-A947-70E740481C1C}">
+                                <a14:useLocalDpi xmlns:a14="http://schemas.microsoft.com/office/drawing/2010/main" val="0"/>
+                              </a:ext>
+                            </a:extLst>
+                          </a:blip>
+                          <a:srcRect/>
+                          <a:stretch>
+                            <a:fillRect/>
+                          </a:stretch>
+                        </pic:blipFill>
+                        <pic:spPr bwMode="auto">
+                          <a:xfrm>
+                            <a:off x="0" y="0"/>
+                            <a:ext cx="3502123" cy="2771017"/>
+                          </a:xfrm>
+                          <a:prstGeom prst="rect">
+                            <a:avLst/>
+                          </a:prstGeom>
+                          <a:noFill/>
+                          <a:ln>
+                            <a:noFill/>
+                          </a:ln>
+                        </pic:spPr>
+                      </pic:pic>
+                    </a:graphicData>
+                  </a:graphic>
+                </wp:inline>
+              </w:drawing>
+            </w:r>
+          </w:p>
+          <w:p/>
           <w:p>
             <w:pPr>
               <w:jc w:val="center"/>
@@ -5203,12 +5027,22 @@
                 <w:sz w:val="20"/>
                 <w:szCs w:val="20"/>
               </w:rPr>
-              <w:t>Screenshot 15: Firebase Project Settings showing DukaStock Android app registered</w:t>
+              <w:t>Screenshot 16: Command Prompt confirming google-services.json in android/app/</w:t>
             </w:r>
           </w:p>
         </w:tc>
       </w:tr>
     </w:tbl>
+    <w:p>
+      <w:pPr>
+        <w:spacing w:before="100" w:after="100"/>
+      </w:pPr>
+    </w:p>
+    <w:p>
+      <w:pPr>
+        <w:spacing w:before="100" w:after="100"/>
+      </w:pPr>
+    </w:p>
     <w:p>
       <w:pPr>
         <w:spacing w:before="100" w:after="100"/>
@@ -5235,12 +5069,6 @@
         <w:gridCol w:w="9360"/>
       </w:tblGrid>
       <w:tr>
-        <w:tblPrEx>
-          <w:tblCellMar>
-            <w:top w:w="0" w:type="dxa"/>
-            <w:bottom w:w="0" w:type="dxa"/>
-          </w:tblCellMar>
-        </w:tblPrEx>
         <w:tc>
           <w:tcPr>
             <w:tcW w:w="9360" w:type="dxa"/>
@@ -5261,30 +5089,65 @@
           <w:p>
             <w:pPr>
               <w:jc w:val="center"/>
-            </w:pPr>
-            <w:proofErr w:type="gramStart"/>
-            <w:r>
               <w:rPr>
                 <w:rFonts w:ascii="Segoe UI Emoji" w:hAnsi="Segoe UI Emoji" w:cs="Segoe UI Emoji"/>
                 <w:b/>
                 <w:bCs/>
               </w:rPr>
-              <w:t>📸</w:t>
-            </w:r>
-            <w:r>
-              <w:rPr>
-                <w:b/>
-                <w:bCs/>
-              </w:rPr>
-              <w:t xml:space="preserve">  INSERT</w:t>
-            </w:r>
-            <w:proofErr w:type="gramEnd"/>
-            <w:r>
-              <w:rPr>
-                <w:b/>
-                <w:bCs/>
-              </w:rPr>
-              <w:t xml:space="preserve"> SCREENSHOT HERE</w:t>
+            </w:pPr>
+            <w:r>
+              <w:rPr>
+                <w:noProof/>
+              </w:rPr>
+              <w:lastRenderedPageBreak/>
+              <w:drawing>
+                <wp:inline distT="0" distB="0" distL="0" distR="0" wp14:anchorId="32130FEC" wp14:editId="714C8EEA">
+                  <wp:extent cx="1331089" cy="2563319"/>
+                  <wp:effectExtent l="0" t="0" r="2540" b="8890"/>
+                  <wp:docPr id="1661035229" name="Picture 11"/>
+                  <wp:cNvGraphicFramePr>
+                    <a:graphicFrameLocks xmlns:a="http://schemas.openxmlformats.org/drawingml/2006/main" noChangeAspect="1"/>
+                  </wp:cNvGraphicFramePr>
+                  <a:graphic xmlns:a="http://schemas.openxmlformats.org/drawingml/2006/main">
+                    <a:graphicData uri="http://schemas.openxmlformats.org/drawingml/2006/picture">
+                      <pic:pic xmlns:pic="http://schemas.openxmlformats.org/drawingml/2006/picture">
+                        <pic:nvPicPr>
+                          <pic:cNvPr id="0" name="Picture 36"/>
+                          <pic:cNvPicPr>
+                            <a:picLocks noChangeAspect="1" noChangeArrowheads="1"/>
+                          </pic:cNvPicPr>
+                        </pic:nvPicPr>
+                        <pic:blipFill>
+                          <a:blip r:embed="rId19" cstate="print">
+                            <a:extLst>
+                              <a:ext uri="{28A0092B-C50C-407E-A947-70E740481C1C}">
+                                <a14:useLocalDpi xmlns:a14="http://schemas.microsoft.com/office/drawing/2010/main" val="0"/>
+                              </a:ext>
+                            </a:extLst>
+                          </a:blip>
+                          <a:srcRect/>
+                          <a:stretch>
+                            <a:fillRect/>
+                          </a:stretch>
+                        </pic:blipFill>
+                        <pic:spPr bwMode="auto">
+                          <a:xfrm>
+                            <a:off x="0" y="0"/>
+                            <a:ext cx="1338450" cy="2577494"/>
+                          </a:xfrm>
+                          <a:prstGeom prst="rect">
+                            <a:avLst/>
+                          </a:prstGeom>
+                          <a:noFill/>
+                          <a:ln>
+                            <a:noFill/>
+                          </a:ln>
+                        </pic:spPr>
+                      </pic:pic>
+                    </a:graphicData>
+                  </a:graphic>
+                </wp:inline>
+              </w:drawing>
             </w:r>
           </w:p>
           <w:p>
@@ -5298,29 +5161,7 @@
                 <w:sz w:val="20"/>
                 <w:szCs w:val="20"/>
               </w:rPr>
-              <w:t>Screenshot 16: Command Prompt confirming google-</w:t>
-            </w:r>
-            <w:proofErr w:type="spellStart"/>
-            <w:proofErr w:type="gramStart"/>
-            <w:r>
-              <w:rPr>
-                <w:i/>
-                <w:iCs/>
-                <w:sz w:val="20"/>
-                <w:szCs w:val="20"/>
-              </w:rPr>
-              <w:t>services.json</w:t>
-            </w:r>
-            <w:proofErr w:type="spellEnd"/>
-            <w:proofErr w:type="gramEnd"/>
-            <w:r>
-              <w:rPr>
-                <w:i/>
-                <w:iCs/>
-                <w:sz w:val="20"/>
-                <w:szCs w:val="20"/>
-              </w:rPr>
-              <w:t xml:space="preserve"> in android/app/</w:t>
+              <w:t>Screenshot 19: DukaStock Login screen running on Redmi Note 14</w:t>
             </w:r>
           </w:p>
         </w:tc>
@@ -5352,12 +5193,6 @@
         <w:gridCol w:w="9360"/>
       </w:tblGrid>
       <w:tr>
-        <w:tblPrEx>
-          <w:tblCellMar>
-            <w:top w:w="0" w:type="dxa"/>
-            <w:bottom w:w="0" w:type="dxa"/>
-          </w:tblCellMar>
-        </w:tblPrEx>
         <w:tc>
           <w:tcPr>
             <w:tcW w:w="9360" w:type="dxa"/>
@@ -5378,30 +5213,64 @@
           <w:p>
             <w:pPr>
               <w:jc w:val="center"/>
-            </w:pPr>
-            <w:proofErr w:type="gramStart"/>
-            <w:r>
               <w:rPr>
                 <w:rFonts w:ascii="Segoe UI Emoji" w:hAnsi="Segoe UI Emoji" w:cs="Segoe UI Emoji"/>
                 <w:b/>
                 <w:bCs/>
               </w:rPr>
-              <w:t>📸</w:t>
-            </w:r>
-            <w:r>
-              <w:rPr>
-                <w:b/>
-                <w:bCs/>
-              </w:rPr>
-              <w:t xml:space="preserve">  INSERT</w:t>
-            </w:r>
-            <w:proofErr w:type="gramEnd"/>
-            <w:r>
-              <w:rPr>
-                <w:b/>
-                <w:bCs/>
-              </w:rPr>
-              <w:t xml:space="preserve"> SCREENSHOT HERE</w:t>
+            </w:pPr>
+            <w:r>
+              <w:rPr>
+                <w:noProof/>
+              </w:rPr>
+              <w:drawing>
+                <wp:inline distT="0" distB="0" distL="0" distR="0" wp14:anchorId="1019AC28" wp14:editId="4FD9CAF9">
+                  <wp:extent cx="1684117" cy="2973070"/>
+                  <wp:effectExtent l="0" t="0" r="0" b="0"/>
+                  <wp:docPr id="500604460" name="Picture 12"/>
+                  <wp:cNvGraphicFramePr>
+                    <a:graphicFrameLocks xmlns:a="http://schemas.openxmlformats.org/drawingml/2006/main" noChangeAspect="1"/>
+                  </wp:cNvGraphicFramePr>
+                  <a:graphic xmlns:a="http://schemas.openxmlformats.org/drawingml/2006/main">
+                    <a:graphicData uri="http://schemas.openxmlformats.org/drawingml/2006/picture">
+                      <pic:pic xmlns:pic="http://schemas.openxmlformats.org/drawingml/2006/picture">
+                        <pic:nvPicPr>
+                          <pic:cNvPr id="0" name="Picture 38"/>
+                          <pic:cNvPicPr>
+                            <a:picLocks noChangeAspect="1" noChangeArrowheads="1"/>
+                          </pic:cNvPicPr>
+                        </pic:nvPicPr>
+                        <pic:blipFill>
+                          <a:blip r:embed="rId20" cstate="print">
+                            <a:extLst>
+                              <a:ext uri="{28A0092B-C50C-407E-A947-70E740481C1C}">
+                                <a14:useLocalDpi xmlns:a14="http://schemas.microsoft.com/office/drawing/2010/main" val="0"/>
+                              </a:ext>
+                            </a:extLst>
+                          </a:blip>
+                          <a:srcRect/>
+                          <a:stretch>
+                            <a:fillRect/>
+                          </a:stretch>
+                        </pic:blipFill>
+                        <pic:spPr bwMode="auto">
+                          <a:xfrm>
+                            <a:off x="0" y="0"/>
+                            <a:ext cx="1691490" cy="2986087"/>
+                          </a:xfrm>
+                          <a:prstGeom prst="rect">
+                            <a:avLst/>
+                          </a:prstGeom>
+                          <a:noFill/>
+                          <a:ln>
+                            <a:noFill/>
+                          </a:ln>
+                        </pic:spPr>
+                      </pic:pic>
+                    </a:graphicData>
+                  </a:graphic>
+                </wp:inline>
+              </w:drawing>
             </w:r>
           </w:p>
           <w:p>
@@ -5415,7 +5284,7 @@
                 <w:sz w:val="20"/>
                 <w:szCs w:val="20"/>
               </w:rPr>
-              <w:t>Screenshot 17: flutter pub add output showing all three Firebase packages installed</w:t>
+              <w:t>Screenshot 20: DukaStock Registration screen showing Retailer/Wholesaler role selector</w:t>
             </w:r>
           </w:p>
         </w:tc>
@@ -5447,12 +5316,6 @@
         <w:gridCol w:w="9360"/>
       </w:tblGrid>
       <w:tr>
-        <w:tblPrEx>
-          <w:tblCellMar>
-            <w:top w:w="0" w:type="dxa"/>
-            <w:bottom w:w="0" w:type="dxa"/>
-          </w:tblCellMar>
-        </w:tblPrEx>
         <w:tc>
           <w:tcPr>
             <w:tcW w:w="9360" w:type="dxa"/>
@@ -5473,46 +5336,72 @@
           <w:p>
             <w:pPr>
               <w:jc w:val="center"/>
-            </w:pPr>
-            <w:proofErr w:type="gramStart"/>
-            <w:r>
-              <w:rPr>
-                <w:rFonts w:ascii="Segoe UI Emoji" w:hAnsi="Segoe UI Emoji" w:cs="Segoe UI Emoji"/>
-                <w:b/>
-                <w:bCs/>
-              </w:rPr>
-              <w:t>📸</w:t>
-            </w:r>
-            <w:r>
-              <w:rPr>
-                <w:b/>
-                <w:bCs/>
-              </w:rPr>
-              <w:t xml:space="preserve">  INSERT</w:t>
-            </w:r>
-            <w:proofErr w:type="gramEnd"/>
-            <w:r>
-              <w:rPr>
-                <w:b/>
-                <w:bCs/>
-              </w:rPr>
-              <w:t xml:space="preserve"> SCREENSHOT HERE</w:t>
-            </w:r>
-          </w:p>
-          <w:p>
-            <w:pPr>
-              <w:jc w:val="center"/>
-            </w:pPr>
-            <w:r>
               <w:rPr>
                 <w:i/>
                 <w:iCs/>
                 <w:sz w:val="20"/>
                 <w:szCs w:val="20"/>
               </w:rPr>
-              <w:t xml:space="preserve">Screenshot 18: app-level </w:t>
-            </w:r>
-            <w:proofErr w:type="spellStart"/>
+            </w:pPr>
+            <w:r>
+              <w:rPr>
+                <w:noProof/>
+              </w:rPr>
+              <w:lastRenderedPageBreak/>
+              <w:drawing>
+                <wp:inline distT="0" distB="0" distL="0" distR="0" wp14:anchorId="25C2DA71" wp14:editId="30C6A5F7">
+                  <wp:extent cx="1464197" cy="2383547"/>
+                  <wp:effectExtent l="0" t="0" r="3175" b="0"/>
+                  <wp:docPr id="1201875651" name="Picture 13"/>
+                  <wp:cNvGraphicFramePr>
+                    <a:graphicFrameLocks xmlns:a="http://schemas.openxmlformats.org/drawingml/2006/main" noChangeAspect="1"/>
+                  </wp:cNvGraphicFramePr>
+                  <a:graphic xmlns:a="http://schemas.openxmlformats.org/drawingml/2006/main">
+                    <a:graphicData uri="http://schemas.openxmlformats.org/drawingml/2006/picture">
+                      <pic:pic xmlns:pic="http://schemas.openxmlformats.org/drawingml/2006/picture">
+                        <pic:nvPicPr>
+                          <pic:cNvPr id="0" name="Picture 40"/>
+                          <pic:cNvPicPr>
+                            <a:picLocks noChangeAspect="1" noChangeArrowheads="1"/>
+                          </pic:cNvPicPr>
+                        </pic:nvPicPr>
+                        <pic:blipFill>
+                          <a:blip r:embed="rId21" cstate="print">
+                            <a:extLst>
+                              <a:ext uri="{28A0092B-C50C-407E-A947-70E740481C1C}">
+                                <a14:useLocalDpi xmlns:a14="http://schemas.microsoft.com/office/drawing/2010/main" val="0"/>
+                              </a:ext>
+                            </a:extLst>
+                          </a:blip>
+                          <a:srcRect/>
+                          <a:stretch>
+                            <a:fillRect/>
+                          </a:stretch>
+                        </pic:blipFill>
+                        <pic:spPr bwMode="auto">
+                          <a:xfrm>
+                            <a:off x="0" y="0"/>
+                            <a:ext cx="1469346" cy="2391929"/>
+                          </a:xfrm>
+                          <a:prstGeom prst="rect">
+                            <a:avLst/>
+                          </a:prstGeom>
+                          <a:noFill/>
+                          <a:ln>
+                            <a:noFill/>
+                          </a:ln>
+                        </pic:spPr>
+                      </pic:pic>
+                    </a:graphicData>
+                  </a:graphic>
+                </wp:inline>
+              </w:drawing>
+            </w:r>
+          </w:p>
+          <w:p>
+            <w:pPr>
+              <w:jc w:val="center"/>
+            </w:pPr>
             <w:r>
               <w:rPr>
                 <w:i/>
@@ -5520,17 +5409,7 @@
                 <w:sz w:val="20"/>
                 <w:szCs w:val="20"/>
               </w:rPr>
-              <w:t>build.gradle.kts</w:t>
-            </w:r>
-            <w:proofErr w:type="spellEnd"/>
-            <w:r>
-              <w:rPr>
-                <w:i/>
-                <w:iCs/>
-                <w:sz w:val="20"/>
-                <w:szCs w:val="20"/>
-              </w:rPr>
-              <w:t xml:space="preserve"> with Google Services plugin added</w:t>
+              <w:t>Screenshot 21: Retailer Dashboard — Welcome, Retailer! with 4 menu cards</w:t>
             </w:r>
           </w:p>
         </w:tc>
@@ -5562,12 +5441,6 @@
         <w:gridCol w:w="9360"/>
       </w:tblGrid>
       <w:tr>
-        <w:tblPrEx>
-          <w:tblCellMar>
-            <w:top w:w="0" w:type="dxa"/>
-            <w:bottom w:w="0" w:type="dxa"/>
-          </w:tblCellMar>
-        </w:tblPrEx>
         <w:tc>
           <w:tcPr>
             <w:tcW w:w="9360" w:type="dxa"/>
@@ -5588,49 +5461,94 @@
           <w:p>
             <w:pPr>
               <w:jc w:val="center"/>
-            </w:pPr>
-            <w:proofErr w:type="gramStart"/>
-            <w:r>
-              <w:rPr>
-                <w:rFonts w:ascii="Segoe UI Emoji" w:hAnsi="Segoe UI Emoji" w:cs="Segoe UI Emoji"/>
-                <w:b/>
-                <w:bCs/>
-              </w:rPr>
-              <w:t>📸</w:t>
-            </w:r>
-            <w:r>
-              <w:rPr>
-                <w:b/>
-                <w:bCs/>
-              </w:rPr>
-              <w:t xml:space="preserve">  INSERT</w:t>
-            </w:r>
-            <w:proofErr w:type="gramEnd"/>
-            <w:r>
-              <w:rPr>
-                <w:b/>
-                <w:bCs/>
-              </w:rPr>
-              <w:t xml:space="preserve"> SCREENSHOT HERE</w:t>
-            </w:r>
-          </w:p>
-          <w:p>
-            <w:pPr>
-              <w:jc w:val="center"/>
-            </w:pPr>
-            <w:r>
               <w:rPr>
                 <w:i/>
                 <w:iCs/>
                 <w:sz w:val="20"/>
                 <w:szCs w:val="20"/>
               </w:rPr>
-              <w:t>Screenshot 19: DukaStock Login screen running on Redmi Note 14</w:t>
+            </w:pPr>
+            <w:r>
+              <w:rPr>
+                <w:noProof/>
+              </w:rPr>
+              <w:drawing>
+                <wp:inline distT="0" distB="0" distL="0" distR="0" wp14:anchorId="71AF4406" wp14:editId="3805E134">
+                  <wp:extent cx="1695189" cy="2354580"/>
+                  <wp:effectExtent l="0" t="0" r="635" b="7620"/>
+                  <wp:docPr id="972732269" name="Picture 14"/>
+                  <wp:cNvGraphicFramePr>
+                    <a:graphicFrameLocks xmlns:a="http://schemas.openxmlformats.org/drawingml/2006/main" noChangeAspect="1"/>
+                  </wp:cNvGraphicFramePr>
+                  <a:graphic xmlns:a="http://schemas.openxmlformats.org/drawingml/2006/main">
+                    <a:graphicData uri="http://schemas.openxmlformats.org/drawingml/2006/picture">
+                      <pic:pic xmlns:pic="http://schemas.openxmlformats.org/drawingml/2006/picture">
+                        <pic:nvPicPr>
+                          <pic:cNvPr id="0" name="Picture 42"/>
+                          <pic:cNvPicPr>
+                            <a:picLocks noChangeAspect="1" noChangeArrowheads="1"/>
+                          </pic:cNvPicPr>
+                        </pic:nvPicPr>
+                        <pic:blipFill>
+                          <a:blip r:embed="rId22" cstate="print">
+                            <a:extLst>
+                              <a:ext uri="{28A0092B-C50C-407E-A947-70E740481C1C}">
+                                <a14:useLocalDpi xmlns:a14="http://schemas.microsoft.com/office/drawing/2010/main" val="0"/>
+                              </a:ext>
+                            </a:extLst>
+                          </a:blip>
+                          <a:srcRect/>
+                          <a:stretch>
+                            <a:fillRect/>
+                          </a:stretch>
+                        </pic:blipFill>
+                        <pic:spPr bwMode="auto">
+                          <a:xfrm>
+                            <a:off x="0" y="0"/>
+                            <a:ext cx="1703916" cy="2366701"/>
+                          </a:xfrm>
+                          <a:prstGeom prst="rect">
+                            <a:avLst/>
+                          </a:prstGeom>
+                          <a:noFill/>
+                          <a:ln>
+                            <a:noFill/>
+                          </a:ln>
+                        </pic:spPr>
+                      </pic:pic>
+                    </a:graphicData>
+                  </a:graphic>
+                </wp:inline>
+              </w:drawing>
+            </w:r>
+          </w:p>
+          <w:p>
+            <w:pPr>
+              <w:jc w:val="center"/>
+            </w:pPr>
+            <w:r>
+              <w:rPr>
+                <w:i/>
+                <w:iCs/>
+                <w:sz w:val="20"/>
+                <w:szCs w:val="20"/>
+              </w:rPr>
+              <w:t>Screenshot 22: Wholesaler Dashboard — Welcome, Wholesaler! with 4 menu cards</w:t>
             </w:r>
           </w:p>
         </w:tc>
       </w:tr>
     </w:tbl>
+    <w:p>
+      <w:pPr>
+        <w:spacing w:before="100" w:after="100"/>
+      </w:pPr>
+    </w:p>
+    <w:p>
+      <w:pPr>
+        <w:spacing w:before="100" w:after="100"/>
+      </w:pPr>
+    </w:p>
     <w:p>
       <w:pPr>
         <w:spacing w:before="100" w:after="100"/>
@@ -5657,12 +5575,6 @@
         <w:gridCol w:w="9360"/>
       </w:tblGrid>
       <w:tr>
-        <w:tblPrEx>
-          <w:tblCellMar>
-            <w:top w:w="0" w:type="dxa"/>
-            <w:bottom w:w="0" w:type="dxa"/>
-          </w:tblCellMar>
-        </w:tblPrEx>
         <w:tc>
           <w:tcPr>
             <w:tcW w:w="9360" w:type="dxa"/>
@@ -5683,49 +5595,552 @@
           <w:p>
             <w:pPr>
               <w:jc w:val="center"/>
-            </w:pPr>
-            <w:proofErr w:type="gramStart"/>
-            <w:r>
-              <w:rPr>
-                <w:rFonts w:ascii="Segoe UI Emoji" w:hAnsi="Segoe UI Emoji" w:cs="Segoe UI Emoji"/>
-                <w:b/>
-                <w:bCs/>
-              </w:rPr>
-              <w:t>📸</w:t>
-            </w:r>
-            <w:r>
-              <w:rPr>
-                <w:b/>
-                <w:bCs/>
-              </w:rPr>
-              <w:t xml:space="preserve">  INSERT</w:t>
-            </w:r>
-            <w:proofErr w:type="gramEnd"/>
-            <w:r>
-              <w:rPr>
-                <w:b/>
-                <w:bCs/>
-              </w:rPr>
-              <w:t xml:space="preserve"> SCREENSHOT HERE</w:t>
-            </w:r>
-          </w:p>
-          <w:p>
-            <w:pPr>
-              <w:jc w:val="center"/>
-            </w:pPr>
-            <w:r>
               <w:rPr>
                 <w:i/>
                 <w:iCs/>
                 <w:sz w:val="20"/>
                 <w:szCs w:val="20"/>
               </w:rPr>
-              <w:t>Screenshot 20: DukaStock Registration screen showing Retailer/Wholesaler role selector</w:t>
+            </w:pPr>
+            <w:r>
+              <w:rPr>
+                <w:i/>
+                <w:iCs/>
+                <w:sz w:val="20"/>
+                <w:szCs w:val="20"/>
+              </w:rPr>
+              <w:lastRenderedPageBreak/>
+              <w:drawing>
+                <wp:inline distT="0" distB="0" distL="0" distR="0" wp14:anchorId="200373EA" wp14:editId="33E374D5">
+                  <wp:extent cx="3252486" cy="2021840"/>
+                  <wp:effectExtent l="0" t="0" r="5080" b="0"/>
+                  <wp:docPr id="1407969645" name="Picture 1"/>
+                  <wp:cNvGraphicFramePr>
+                    <a:graphicFrameLocks xmlns:a="http://schemas.openxmlformats.org/drawingml/2006/main" noChangeAspect="1"/>
+                  </wp:cNvGraphicFramePr>
+                  <a:graphic xmlns:a="http://schemas.openxmlformats.org/drawingml/2006/main">
+                    <a:graphicData uri="http://schemas.openxmlformats.org/drawingml/2006/picture">
+                      <pic:pic xmlns:pic="http://schemas.openxmlformats.org/drawingml/2006/picture">
+                        <pic:nvPicPr>
+                          <pic:cNvPr id="1407969645" name=""/>
+                          <pic:cNvPicPr/>
+                        </pic:nvPicPr>
+                        <pic:blipFill>
+                          <a:blip r:embed="rId23"/>
+                          <a:stretch>
+                            <a:fillRect/>
+                          </a:stretch>
+                        </pic:blipFill>
+                        <pic:spPr>
+                          <a:xfrm>
+                            <a:off x="0" y="0"/>
+                            <a:ext cx="3256442" cy="2024299"/>
+                          </a:xfrm>
+                          <a:prstGeom prst="rect">
+                            <a:avLst/>
+                          </a:prstGeom>
+                        </pic:spPr>
+                      </pic:pic>
+                    </a:graphicData>
+                  </a:graphic>
+                </wp:inline>
+              </w:drawing>
+            </w:r>
+          </w:p>
+          <w:p>
+            <w:pPr>
+              <w:jc w:val="center"/>
+            </w:pPr>
+            <w:r>
+              <w:rPr>
+                <w:i/>
+                <w:iCs/>
+                <w:sz w:val="20"/>
+                <w:szCs w:val="20"/>
+              </w:rPr>
+              <w:t>Screenshot 25: git push output showing Week 2 code pushed to GitHub</w:t>
             </w:r>
           </w:p>
         </w:tc>
       </w:tr>
     </w:tbl>
+    <w:p>
+      <w:pPr>
+        <w:spacing w:before="100" w:after="100"/>
+      </w:pPr>
+    </w:p>
+    <w:p>
+      <w:pPr>
+        <w:pStyle w:val="Heading2"/>
+        <w:rPr>
+          <w:color w:val="auto"/>
+        </w:rPr>
+      </w:pPr>
+      <w:bookmarkStart w:id="10" w:name="_Toc231911472"/>
+      <w:r>
+        <w:rPr>
+          <w:rFonts w:ascii="Arial" w:eastAsia="Arial" w:hAnsi="Arial" w:cs="Arial"/>
+          <w:b/>
+          <w:bCs/>
+          <w:color w:val="auto"/>
+          <w:sz w:val="26"/>
+          <w:szCs w:val="26"/>
+        </w:rPr>
+        <w:t>Tools / Software Used</w:t>
+      </w:r>
+      <w:bookmarkEnd w:id="10"/>
+    </w:p>
+    <w:p>
+      <w:pPr>
+        <w:spacing w:before="100" w:after="100"/>
+      </w:pPr>
+    </w:p>
+    <w:p>
+      <w:pPr>
+        <w:pStyle w:val="ListParagraph"/>
+        <w:numPr>
+          <w:ilvl w:val="0"/>
+          <w:numId w:val="2"/>
+        </w:numPr>
+        <w:spacing w:before="60" w:after="60"/>
+        <w:contextualSpacing w:val="0"/>
+      </w:pPr>
+      <w:r>
+        <w:t>Firebase Console (console.firebase.google.com)</w:t>
+      </w:r>
+    </w:p>
+    <w:p>
+      <w:pPr>
+        <w:pStyle w:val="ListParagraph"/>
+        <w:numPr>
+          <w:ilvl w:val="0"/>
+          <w:numId w:val="2"/>
+        </w:numPr>
+        <w:spacing w:before="60" w:after="60"/>
+        <w:contextualSpacing w:val="0"/>
+      </w:pPr>
+      <w:r>
+        <w:t>Firebase Authentication</w:t>
+      </w:r>
+    </w:p>
+    <w:p>
+      <w:pPr>
+        <w:pStyle w:val="ListParagraph"/>
+        <w:numPr>
+          <w:ilvl w:val="0"/>
+          <w:numId w:val="2"/>
+        </w:numPr>
+        <w:spacing w:before="60" w:after="60"/>
+        <w:contextualSpacing w:val="0"/>
+      </w:pPr>
+      <w:r>
+        <w:t>Cloud Firestore</w:t>
+      </w:r>
+    </w:p>
+    <w:p>
+      <w:pPr>
+        <w:pStyle w:val="ListParagraph"/>
+        <w:numPr>
+          <w:ilvl w:val="0"/>
+          <w:numId w:val="2"/>
+        </w:numPr>
+        <w:spacing w:before="60" w:after="60"/>
+        <w:contextualSpacing w:val="0"/>
+      </w:pPr>
+      <w:r>
+        <w:t>Flutter SDK 3.44.0</w:t>
+      </w:r>
+    </w:p>
+    <w:p>
+      <w:pPr>
+        <w:pStyle w:val="ListParagraph"/>
+        <w:numPr>
+          <w:ilvl w:val="0"/>
+          <w:numId w:val="2"/>
+        </w:numPr>
+        <w:spacing w:before="60" w:after="60"/>
+        <w:contextualSpacing w:val="0"/>
+      </w:pPr>
+      <w:r>
+        <w:t>firebase_core, firebase_auth, cloud_firestore packages</w:t>
+      </w:r>
+    </w:p>
+    <w:p>
+      <w:pPr>
+        <w:pStyle w:val="ListParagraph"/>
+        <w:numPr>
+          <w:ilvl w:val="0"/>
+          <w:numId w:val="2"/>
+        </w:numPr>
+        <w:spacing w:before="60" w:after="60"/>
+        <w:contextualSpacing w:val="0"/>
+      </w:pPr>
+      <w:r>
+        <w:t>Android Studio — Gradle configuration</w:t>
+      </w:r>
+    </w:p>
+    <w:p>
+      <w:pPr>
+        <w:pStyle w:val="ListParagraph"/>
+        <w:numPr>
+          <w:ilvl w:val="0"/>
+          <w:numId w:val="2"/>
+        </w:numPr>
+        <w:spacing w:before="60" w:after="60"/>
+        <w:contextualSpacing w:val="0"/>
+      </w:pPr>
+      <w:r>
+        <w:t>Redmi Note 14 — USB debugging</w:t>
+      </w:r>
+    </w:p>
+    <w:p>
+      <w:pPr>
+        <w:pStyle w:val="ListParagraph"/>
+        <w:numPr>
+          <w:ilvl w:val="0"/>
+          <w:numId w:val="2"/>
+        </w:numPr>
+        <w:spacing w:before="60" w:after="60"/>
+        <w:contextualSpacing w:val="0"/>
+      </w:pPr>
+      <w:r>
+        <w:t>MiniTool Partition Wizard Free 13.6</w:t>
+      </w:r>
+    </w:p>
+    <w:p>
+      <w:pPr>
+        <w:pStyle w:val="ListParagraph"/>
+        <w:numPr>
+          <w:ilvl w:val="0"/>
+          <w:numId w:val="2"/>
+        </w:numPr>
+        <w:spacing w:before="60" w:after="60"/>
+        <w:contextualSpacing w:val="0"/>
+      </w:pPr>
+      <w:r>
+        <w:t>Git + GitHub</w:t>
+      </w:r>
+    </w:p>
+    <w:p>
+      <w:pPr>
+        <w:spacing w:before="100" w:after="100"/>
+      </w:pPr>
+    </w:p>
+    <w:p>
+      <w:pPr>
+        <w:pStyle w:val="Heading2"/>
+        <w:rPr>
+          <w:color w:val="auto"/>
+        </w:rPr>
+      </w:pPr>
+      <w:bookmarkStart w:id="11" w:name="_Toc231911473"/>
+      <w:r>
+        <w:rPr>
+          <w:rFonts w:ascii="Arial" w:eastAsia="Arial" w:hAnsi="Arial" w:cs="Arial"/>
+          <w:b/>
+          <w:bCs/>
+          <w:color w:val="auto"/>
+          <w:sz w:val="26"/>
+          <w:szCs w:val="26"/>
+        </w:rPr>
+        <w:t>Personal Reflection</w:t>
+      </w:r>
+      <w:bookmarkEnd w:id="11"/>
+    </w:p>
+    <w:p>
+      <w:pPr>
+        <w:spacing w:before="100" w:after="100"/>
+      </w:pPr>
+    </w:p>
+    <w:p>
+      <w:r>
+        <w:t>This week I integrated Firebase into DukaStock and built working authentication. The key challenge was a package name mismatch between Firebase and Flutter which caused a Gradle build failure. I resolved it by registering a new Android app in Firebase with the exact package name from build.gradle.kts</w:t>
+      </w:r>
+      <w:r>
+        <w:br w:type="page"/>
+      </w:r>
+    </w:p>
+    <w:p>
+      <w:pPr>
+        <w:pStyle w:val="Heading1"/>
+        <w:pBdr>
+          <w:bottom w:val="single" w:sz="8" w:space="1" w:color="1B5E20"/>
+        </w:pBdr>
+        <w:rPr>
+          <w:color w:val="auto"/>
+        </w:rPr>
+      </w:pPr>
+      <w:bookmarkStart w:id="12" w:name="_Toc231911474"/>
+      <w:r>
+        <w:rPr>
+          <w:rFonts w:ascii="Arial" w:eastAsia="Arial" w:hAnsi="Arial" w:cs="Arial"/>
+          <w:b/>
+          <w:bCs/>
+          <w:color w:val="auto"/>
+          <w:sz w:val="32"/>
+          <w:szCs w:val="32"/>
+        </w:rPr>
+        <w:lastRenderedPageBreak/>
+        <w:t>Week 3: User Interface Design</w:t>
+      </w:r>
+      <w:bookmarkEnd w:id="12"/>
+    </w:p>
+    <w:p>
+      <w:pPr>
+        <w:spacing w:before="100" w:after="100"/>
+      </w:pPr>
+    </w:p>
+    <w:p>
+      <w:pPr>
+        <w:pStyle w:val="Heading2"/>
+        <w:rPr>
+          <w:color w:val="auto"/>
+        </w:rPr>
+      </w:pPr>
+      <w:bookmarkStart w:id="13" w:name="_Toc231911475"/>
+      <w:r>
+        <w:rPr>
+          <w:rFonts w:ascii="Arial" w:eastAsia="Arial" w:hAnsi="Arial" w:cs="Arial"/>
+          <w:b/>
+          <w:bCs/>
+          <w:color w:val="auto"/>
+          <w:sz w:val="26"/>
+          <w:szCs w:val="26"/>
+        </w:rPr>
+        <w:t>Practical Activities Undertaken</w:t>
+      </w:r>
+      <w:bookmarkEnd w:id="13"/>
+    </w:p>
+    <w:p>
+      <w:pPr>
+        <w:spacing w:before="100" w:after="100"/>
+      </w:pPr>
+    </w:p>
+    <w:p>
+      <w:pPr>
+        <w:pStyle w:val="ListParagraph"/>
+        <w:numPr>
+          <w:ilvl w:val="0"/>
+          <w:numId w:val="2"/>
+        </w:numPr>
+        <w:spacing w:before="60" w:after="60"/>
+        <w:contextualSpacing w:val="0"/>
+      </w:pPr>
+      <w:r>
+        <w:t>Created DukaStock UI project in Figma for professional wireframe design</w:t>
+      </w:r>
+    </w:p>
+    <w:p>
+      <w:pPr>
+        <w:pStyle w:val="ListParagraph"/>
+        <w:numPr>
+          <w:ilvl w:val="0"/>
+          <w:numId w:val="2"/>
+        </w:numPr>
+        <w:spacing w:before="60" w:after="60"/>
+        <w:contextualSpacing w:val="0"/>
+      </w:pPr>
+      <w:r>
+        <w:t>Designed Login screen wireframe in Figma with DukaStock branding, email/password fields, Log In / Register tabs, and green button</w:t>
+      </w:r>
+    </w:p>
+    <w:p>
+      <w:pPr>
+        <w:pStyle w:val="ListParagraph"/>
+        <w:numPr>
+          <w:ilvl w:val="0"/>
+          <w:numId w:val="2"/>
+        </w:numPr>
+        <w:spacing w:before="60" w:after="60"/>
+        <w:contextualSpacing w:val="0"/>
+      </w:pPr>
+      <w:r>
+        <w:t>Designed Register screen wireframe with Full Name, Email, Password fields and Retailer/Wholesaler role selector tabs</w:t>
+      </w:r>
+    </w:p>
+    <w:p>
+      <w:pPr>
+        <w:pStyle w:val="ListParagraph"/>
+        <w:numPr>
+          <w:ilvl w:val="0"/>
+          <w:numId w:val="2"/>
+        </w:numPr>
+        <w:spacing w:before="60" w:after="60"/>
+        <w:contextualSpacing w:val="0"/>
+      </w:pPr>
+      <w:r>
+        <w:t>Designed Reset Password screen with new password and confirm password fields</w:t>
+      </w:r>
+    </w:p>
+    <w:p>
+      <w:pPr>
+        <w:pStyle w:val="ListParagraph"/>
+        <w:numPr>
+          <w:ilvl w:val="0"/>
+          <w:numId w:val="2"/>
+        </w:numPr>
+        <w:spacing w:before="60" w:after="60"/>
+        <w:contextualSpacing w:val="0"/>
+      </w:pPr>
+      <w:r>
+        <w:t>Designed Retailer Dashboard wireframe with green app bar, welcome banner, and 4 menu cards grid</w:t>
+      </w:r>
+    </w:p>
+    <w:p>
+      <w:pPr>
+        <w:pStyle w:val="ListParagraph"/>
+        <w:numPr>
+          <w:ilvl w:val="0"/>
+          <w:numId w:val="2"/>
+        </w:numPr>
+        <w:spacing w:before="60" w:after="60"/>
+        <w:contextualSpacing w:val="0"/>
+      </w:pPr>
+      <w:r>
+        <w:t>Designed Wholesaler Dashboard wireframe with different role-specific menu cards</w:t>
+      </w:r>
+    </w:p>
+    <w:p>
+      <w:pPr>
+        <w:pStyle w:val="ListParagraph"/>
+        <w:numPr>
+          <w:ilvl w:val="0"/>
+          <w:numId w:val="2"/>
+        </w:numPr>
+        <w:spacing w:before="60" w:after="60"/>
+        <w:contextualSpacing w:val="0"/>
+      </w:pPr>
+      <w:r>
+        <w:t>Designed Product Catalog screen with search bar and product listing cards</w:t>
+      </w:r>
+    </w:p>
+    <w:p>
+      <w:pPr>
+        <w:pStyle w:val="ListParagraph"/>
+        <w:numPr>
+          <w:ilvl w:val="0"/>
+          <w:numId w:val="2"/>
+        </w:numPr>
+        <w:spacing w:before="60" w:after="60"/>
+        <w:contextualSpacing w:val="0"/>
+      </w:pPr>
+      <w:r>
+        <w:t>Converted Figma Login design to Flutter code with improved UI components</w:t>
+      </w:r>
+    </w:p>
+    <w:p>
+      <w:pPr>
+        <w:pStyle w:val="ListParagraph"/>
+        <w:numPr>
+          <w:ilvl w:val="0"/>
+          <w:numId w:val="2"/>
+        </w:numPr>
+        <w:spacing w:before="60" w:after="60"/>
+        <w:contextualSpacing w:val="0"/>
+      </w:pPr>
+      <w:r>
+        <w:t>Converted Figma Register design to Flutter code with visual role selector cards</w:t>
+      </w:r>
+    </w:p>
+    <w:p>
+      <w:pPr>
+        <w:pStyle w:val="ListParagraph"/>
+        <w:numPr>
+          <w:ilvl w:val="0"/>
+          <w:numId w:val="2"/>
+        </w:numPr>
+        <w:spacing w:before="60" w:after="60"/>
+        <w:contextualSpacing w:val="0"/>
+      </w:pPr>
+      <w:r>
+        <w:t>Added form validation for all input fields — empty field checks and email format validation</w:t>
+      </w:r>
+    </w:p>
+    <w:p>
+      <w:pPr>
+        <w:pStyle w:val="ListParagraph"/>
+        <w:numPr>
+          <w:ilvl w:val="0"/>
+          <w:numId w:val="2"/>
+        </w:numPr>
+        <w:spacing w:before="60" w:after="60"/>
+        <w:contextualSpacing w:val="0"/>
+      </w:pPr>
+      <w:r>
+        <w:t>Implemented page transition animations between screens</w:t>
+      </w:r>
+    </w:p>
+    <w:p>
+      <w:pPr>
+        <w:pStyle w:val="ListParagraph"/>
+        <w:numPr>
+          <w:ilvl w:val="0"/>
+          <w:numId w:val="2"/>
+        </w:numPr>
+        <w:spacing w:before="60" w:after="60"/>
+        <w:contextualSpacing w:val="0"/>
+      </w:pPr>
+      <w:r>
+        <w:t>Tested all screens on Redmi Note 14 and verified navigation flow works correctly</w:t>
+      </w:r>
+    </w:p>
+    <w:p>
+      <w:pPr>
+        <w:pStyle w:val="ListParagraph"/>
+        <w:numPr>
+          <w:ilvl w:val="0"/>
+          <w:numId w:val="2"/>
+        </w:numPr>
+        <w:spacing w:before="60" w:after="60"/>
+        <w:contextualSpacing w:val="0"/>
+      </w:pPr>
+      <w:r>
+        <w:t>Pushed all Week 3 UI improvements to GitHub</w:t>
+      </w:r>
+    </w:p>
+    <w:p>
+      <w:pPr>
+        <w:spacing w:before="100" w:after="100"/>
+      </w:pPr>
+    </w:p>
+    <w:p>
+      <w:pPr>
+        <w:pStyle w:val="Heading2"/>
+        <w:rPr>
+          <w:color w:val="auto"/>
+        </w:rPr>
+      </w:pPr>
+      <w:bookmarkStart w:id="14" w:name="_Toc231911476"/>
+      <w:r>
+        <w:rPr>
+          <w:rFonts w:ascii="Arial" w:eastAsia="Arial" w:hAnsi="Arial" w:cs="Arial"/>
+          <w:b/>
+          <w:bCs/>
+          <w:color w:val="auto"/>
+          <w:sz w:val="26"/>
+          <w:szCs w:val="26"/>
+        </w:rPr>
+        <w:t>Screenshots / Evidence Attached</w:t>
+      </w:r>
+      <w:bookmarkEnd w:id="14"/>
+    </w:p>
+    <w:p>
+      <w:pPr>
+        <w:spacing w:before="100" w:after="100"/>
+      </w:pPr>
+    </w:p>
+    <w:p>
+      <w:pPr>
+        <w:spacing w:before="80" w:after="80"/>
+      </w:pPr>
+      <w:r>
+        <w:rPr>
+          <w:b/>
+          <w:bCs/>
+        </w:rPr>
+        <w:t>Screenshots Attached: Yes</w:t>
+      </w:r>
+    </w:p>
     <w:p>
       <w:pPr>
         <w:spacing w:before="100" w:after="100"/>
@@ -5752,12 +6167,6 @@
         <w:gridCol w:w="9360"/>
       </w:tblGrid>
       <w:tr>
-        <w:tblPrEx>
-          <w:tblCellMar>
-            <w:top w:w="0" w:type="dxa"/>
-            <w:bottom w:w="0" w:type="dxa"/>
-          </w:tblCellMar>
-        </w:tblPrEx>
         <w:tc>
           <w:tcPr>
             <w:tcW w:w="9360" w:type="dxa"/>
@@ -5779,7 +6188,6 @@
             <w:pPr>
               <w:jc w:val="center"/>
             </w:pPr>
-            <w:proofErr w:type="gramStart"/>
             <w:r>
               <w:rPr>
                 <w:rFonts w:ascii="Segoe UI Emoji" w:hAnsi="Segoe UI Emoji" w:cs="Segoe UI Emoji"/>
@@ -5793,15 +6201,7 @@
                 <w:b/>
                 <w:bCs/>
               </w:rPr>
-              <w:t xml:space="preserve">  INSERT</w:t>
-            </w:r>
-            <w:proofErr w:type="gramEnd"/>
-            <w:r>
-              <w:rPr>
-                <w:b/>
-                <w:bCs/>
-              </w:rPr>
-              <w:t xml:space="preserve"> SCREENSHOT HERE</w:t>
+              <w:t xml:space="preserve">  INSERT SCREENSHOT HERE</w:t>
             </w:r>
           </w:p>
           <w:p>
@@ -5815,7 +6215,7 @@
                 <w:sz w:val="20"/>
                 <w:szCs w:val="20"/>
               </w:rPr>
-              <w:t>Screenshot 21: Retailer Dashboard — Welcome, Retailer! with 4 menu cards</w:t>
+              <w:t>Screenshot 26: Figma workspace showing DukaStock Login screen wireframe</w:t>
             </w:r>
           </w:p>
         </w:tc>
@@ -5847,12 +6247,6 @@
         <w:gridCol w:w="9360"/>
       </w:tblGrid>
       <w:tr>
-        <w:tblPrEx>
-          <w:tblCellMar>
-            <w:top w:w="0" w:type="dxa"/>
-            <w:bottom w:w="0" w:type="dxa"/>
-          </w:tblCellMar>
-        </w:tblPrEx>
         <w:tc>
           <w:tcPr>
             <w:tcW w:w="9360" w:type="dxa"/>
@@ -5874,14 +6268,12 @@
             <w:pPr>
               <w:jc w:val="center"/>
             </w:pPr>
-            <w:proofErr w:type="gramStart"/>
             <w:r>
               <w:rPr>
                 <w:rFonts w:ascii="Segoe UI Emoji" w:hAnsi="Segoe UI Emoji" w:cs="Segoe UI Emoji"/>
                 <w:b/>
                 <w:bCs/>
               </w:rPr>
-              <w:lastRenderedPageBreak/>
               <w:t>📸</w:t>
             </w:r>
             <w:r>
@@ -5889,15 +6281,7 @@
                 <w:b/>
                 <w:bCs/>
               </w:rPr>
-              <w:t xml:space="preserve">  INSERT</w:t>
-            </w:r>
-            <w:proofErr w:type="gramEnd"/>
-            <w:r>
-              <w:rPr>
-                <w:b/>
-                <w:bCs/>
-              </w:rPr>
-              <w:t xml:space="preserve"> SCREENSHOT HERE</w:t>
+              <w:t xml:space="preserve">  INSERT SCREENSHOT HERE</w:t>
             </w:r>
           </w:p>
           <w:p>
@@ -5911,7 +6295,7 @@
                 <w:sz w:val="20"/>
                 <w:szCs w:val="20"/>
               </w:rPr>
-              <w:t>Screenshot 22: Wholesaler Dashboard — Welcome, Wholesaler! with 4 menu cards</w:t>
+              <w:t>Screenshot 27: Figma workspace showing Register screen with Retailer/Wholesaler selector</w:t>
             </w:r>
           </w:p>
         </w:tc>
@@ -5943,12 +6327,6 @@
         <w:gridCol w:w="9360"/>
       </w:tblGrid>
       <w:tr>
-        <w:tblPrEx>
-          <w:tblCellMar>
-            <w:top w:w="0" w:type="dxa"/>
-            <w:bottom w:w="0" w:type="dxa"/>
-          </w:tblCellMar>
-        </w:tblPrEx>
         <w:tc>
           <w:tcPr>
             <w:tcW w:w="9360" w:type="dxa"/>
@@ -5970,7 +6348,6 @@
             <w:pPr>
               <w:jc w:val="center"/>
             </w:pPr>
-            <w:proofErr w:type="gramStart"/>
             <w:r>
               <w:rPr>
                 <w:rFonts w:ascii="Segoe UI Emoji" w:hAnsi="Segoe UI Emoji" w:cs="Segoe UI Emoji"/>
@@ -5984,15 +6361,7 @@
                 <w:b/>
                 <w:bCs/>
               </w:rPr>
-              <w:t xml:space="preserve">  INSERT</w:t>
-            </w:r>
-            <w:proofErr w:type="gramEnd"/>
-            <w:r>
-              <w:rPr>
-                <w:b/>
-                <w:bCs/>
-              </w:rPr>
-              <w:t xml:space="preserve"> SCREENSHOT HERE</w:t>
+              <w:t xml:space="preserve">  INSERT SCREENSHOT HERE</w:t>
             </w:r>
           </w:p>
           <w:p>
@@ -6006,7 +6375,7 @@
                 <w:sz w:val="20"/>
                 <w:szCs w:val="20"/>
               </w:rPr>
-              <w:t>Screenshot 23: Firebase Authentication console showing registered test user</w:t>
+              <w:t>Screenshot 28: Figma workspace showing Reset Password screen</w:t>
             </w:r>
           </w:p>
         </w:tc>
@@ -6038,12 +6407,6 @@
         <w:gridCol w:w="9360"/>
       </w:tblGrid>
       <w:tr>
-        <w:tblPrEx>
-          <w:tblCellMar>
-            <w:top w:w="0" w:type="dxa"/>
-            <w:bottom w:w="0" w:type="dxa"/>
-          </w:tblCellMar>
-        </w:tblPrEx>
         <w:tc>
           <w:tcPr>
             <w:tcW w:w="9360" w:type="dxa"/>
@@ -6065,13 +6428,13 @@
             <w:pPr>
               <w:jc w:val="center"/>
             </w:pPr>
-            <w:proofErr w:type="gramStart"/>
             <w:r>
               <w:rPr>
                 <w:rFonts w:ascii="Segoe UI Emoji" w:hAnsi="Segoe UI Emoji" w:cs="Segoe UI Emoji"/>
                 <w:b/>
                 <w:bCs/>
               </w:rPr>
+              <w:lastRenderedPageBreak/>
               <w:t>📸</w:t>
             </w:r>
             <w:r>
@@ -6079,15 +6442,7 @@
                 <w:b/>
                 <w:bCs/>
               </w:rPr>
-              <w:t xml:space="preserve">  INSERT</w:t>
-            </w:r>
-            <w:proofErr w:type="gramEnd"/>
-            <w:r>
-              <w:rPr>
-                <w:b/>
-                <w:bCs/>
-              </w:rPr>
-              <w:t xml:space="preserve"> SCREENSHOT HERE</w:t>
+              <w:t xml:space="preserve">  INSERT SCREENSHOT HERE</w:t>
             </w:r>
           </w:p>
           <w:p>
@@ -6101,27 +6456,7 @@
                 <w:sz w:val="20"/>
                 <w:szCs w:val="20"/>
               </w:rPr>
-              <w:t xml:space="preserve">Screenshot 24: </w:t>
-            </w:r>
-            <w:proofErr w:type="spellStart"/>
-            <w:r>
-              <w:rPr>
-                <w:i/>
-                <w:iCs/>
-                <w:sz w:val="20"/>
-                <w:szCs w:val="20"/>
-              </w:rPr>
-              <w:t>Firestore</w:t>
-            </w:r>
-            <w:proofErr w:type="spellEnd"/>
-            <w:r>
-              <w:rPr>
-                <w:i/>
-                <w:iCs/>
-                <w:sz w:val="20"/>
-                <w:szCs w:val="20"/>
-              </w:rPr>
-              <w:t xml:space="preserve"> users collection showing user document with role field</w:t>
+              <w:t>Screenshot 29: Figma workspace showing Retailer Dashboard wireframe</w:t>
             </w:r>
           </w:p>
         </w:tc>
@@ -6153,12 +6488,6 @@
         <w:gridCol w:w="9360"/>
       </w:tblGrid>
       <w:tr>
-        <w:tblPrEx>
-          <w:tblCellMar>
-            <w:top w:w="0" w:type="dxa"/>
-            <w:bottom w:w="0" w:type="dxa"/>
-          </w:tblCellMar>
-        </w:tblPrEx>
         <w:tc>
           <w:tcPr>
             <w:tcW w:w="9360" w:type="dxa"/>
@@ -6180,7 +6509,6 @@
             <w:pPr>
               <w:jc w:val="center"/>
             </w:pPr>
-            <w:proofErr w:type="gramStart"/>
             <w:r>
               <w:rPr>
                 <w:rFonts w:ascii="Segoe UI Emoji" w:hAnsi="Segoe UI Emoji" w:cs="Segoe UI Emoji"/>
@@ -6194,15 +6522,7 @@
                 <w:b/>
                 <w:bCs/>
               </w:rPr>
-              <w:t xml:space="preserve">  INSERT</w:t>
-            </w:r>
-            <w:proofErr w:type="gramEnd"/>
-            <w:r>
-              <w:rPr>
-                <w:b/>
-                <w:bCs/>
-              </w:rPr>
-              <w:t xml:space="preserve"> SCREENSHOT HERE</w:t>
+              <w:t xml:space="preserve">  INSERT SCREENSHOT HERE</w:t>
             </w:r>
           </w:p>
           <w:p>
@@ -6216,518 +6536,12 @@
                 <w:sz w:val="20"/>
                 <w:szCs w:val="20"/>
               </w:rPr>
-              <w:t>Screenshot 25: git push output showing Week 2 code pushed to GitHub</w:t>
+              <w:t>Screenshot 30: Figma workspace showing all 5 screens side by side</w:t>
             </w:r>
           </w:p>
         </w:tc>
       </w:tr>
     </w:tbl>
-    <w:p>
-      <w:pPr>
-        <w:spacing w:before="100" w:after="100"/>
-      </w:pPr>
-    </w:p>
-    <w:p>
-      <w:pPr>
-        <w:pStyle w:val="Heading2"/>
-        <w:rPr>
-          <w:color w:val="auto"/>
-        </w:rPr>
-      </w:pPr>
-      <w:bookmarkStart w:id="10" w:name="_Toc231911472"/>
-      <w:r>
-        <w:rPr>
-          <w:rFonts w:ascii="Arial" w:eastAsia="Arial" w:hAnsi="Arial" w:cs="Arial"/>
-          <w:b/>
-          <w:bCs/>
-          <w:color w:val="auto"/>
-          <w:sz w:val="26"/>
-          <w:szCs w:val="26"/>
-        </w:rPr>
-        <w:t>Tools / Software Used</w:t>
-      </w:r>
-      <w:bookmarkEnd w:id="10"/>
-    </w:p>
-    <w:p>
-      <w:pPr>
-        <w:spacing w:before="100" w:after="100"/>
-      </w:pPr>
-    </w:p>
-    <w:p>
-      <w:pPr>
-        <w:pStyle w:val="ListParagraph"/>
-        <w:numPr>
-          <w:ilvl w:val="0"/>
-          <w:numId w:val="2"/>
-        </w:numPr>
-        <w:spacing w:before="60" w:after="60"/>
-        <w:contextualSpacing w:val="0"/>
-      </w:pPr>
-      <w:r>
-        <w:t>Firebase Console (console.firebase.google.com)</w:t>
-      </w:r>
-    </w:p>
-    <w:p>
-      <w:pPr>
-        <w:pStyle w:val="ListParagraph"/>
-        <w:numPr>
-          <w:ilvl w:val="0"/>
-          <w:numId w:val="2"/>
-        </w:numPr>
-        <w:spacing w:before="60" w:after="60"/>
-        <w:contextualSpacing w:val="0"/>
-      </w:pPr>
-      <w:r>
-        <w:t>Firebase Authentication</w:t>
-      </w:r>
-    </w:p>
-    <w:p>
-      <w:pPr>
-        <w:pStyle w:val="ListParagraph"/>
-        <w:numPr>
-          <w:ilvl w:val="0"/>
-          <w:numId w:val="2"/>
-        </w:numPr>
-        <w:spacing w:before="60" w:after="60"/>
-        <w:contextualSpacing w:val="0"/>
-      </w:pPr>
-      <w:r>
-        <w:t xml:space="preserve">Cloud </w:t>
-      </w:r>
-      <w:proofErr w:type="spellStart"/>
-      <w:r>
-        <w:t>Firestore</w:t>
-      </w:r>
-      <w:proofErr w:type="spellEnd"/>
-    </w:p>
-    <w:p>
-      <w:pPr>
-        <w:pStyle w:val="ListParagraph"/>
-        <w:numPr>
-          <w:ilvl w:val="0"/>
-          <w:numId w:val="2"/>
-        </w:numPr>
-        <w:spacing w:before="60" w:after="60"/>
-        <w:contextualSpacing w:val="0"/>
-      </w:pPr>
-      <w:r>
-        <w:t>Flutter SDK 3.44.0</w:t>
-      </w:r>
-    </w:p>
-    <w:p>
-      <w:pPr>
-        <w:pStyle w:val="ListParagraph"/>
-        <w:numPr>
-          <w:ilvl w:val="0"/>
-          <w:numId w:val="2"/>
-        </w:numPr>
-        <w:spacing w:before="60" w:after="60"/>
-        <w:contextualSpacing w:val="0"/>
-      </w:pPr>
-      <w:proofErr w:type="spellStart"/>
-      <w:r>
-        <w:t>firebase_core</w:t>
-      </w:r>
-      <w:proofErr w:type="spellEnd"/>
-      <w:r>
-        <w:t xml:space="preserve">, </w:t>
-      </w:r>
-      <w:proofErr w:type="spellStart"/>
-      <w:r>
-        <w:t>firebase_auth</w:t>
-      </w:r>
-      <w:proofErr w:type="spellEnd"/>
-      <w:r>
-        <w:t xml:space="preserve">, </w:t>
-      </w:r>
-      <w:proofErr w:type="spellStart"/>
-      <w:r>
-        <w:t>cloud_firestore</w:t>
-      </w:r>
-      <w:proofErr w:type="spellEnd"/>
-      <w:r>
-        <w:t xml:space="preserve"> packages</w:t>
-      </w:r>
-    </w:p>
-    <w:p>
-      <w:pPr>
-        <w:pStyle w:val="ListParagraph"/>
-        <w:numPr>
-          <w:ilvl w:val="0"/>
-          <w:numId w:val="2"/>
-        </w:numPr>
-        <w:spacing w:before="60" w:after="60"/>
-        <w:contextualSpacing w:val="0"/>
-      </w:pPr>
-      <w:r>
-        <w:t>Android Studio — Gradle configuration</w:t>
-      </w:r>
-    </w:p>
-    <w:p>
-      <w:pPr>
-        <w:pStyle w:val="ListParagraph"/>
-        <w:numPr>
-          <w:ilvl w:val="0"/>
-          <w:numId w:val="2"/>
-        </w:numPr>
-        <w:spacing w:before="60" w:after="60"/>
-        <w:contextualSpacing w:val="0"/>
-      </w:pPr>
-      <w:r>
-        <w:t>Redmi Note 14 — USB debugging</w:t>
-      </w:r>
-    </w:p>
-    <w:p>
-      <w:pPr>
-        <w:pStyle w:val="ListParagraph"/>
-        <w:numPr>
-          <w:ilvl w:val="0"/>
-          <w:numId w:val="2"/>
-        </w:numPr>
-        <w:spacing w:before="60" w:after="60"/>
-        <w:contextualSpacing w:val="0"/>
-      </w:pPr>
-      <w:r>
-        <w:t>MiniTool Partition Wizard Free 13.6</w:t>
-      </w:r>
-    </w:p>
-    <w:p>
-      <w:pPr>
-        <w:pStyle w:val="ListParagraph"/>
-        <w:numPr>
-          <w:ilvl w:val="0"/>
-          <w:numId w:val="2"/>
-        </w:numPr>
-        <w:spacing w:before="60" w:after="60"/>
-        <w:contextualSpacing w:val="0"/>
-      </w:pPr>
-      <w:r>
-        <w:t>Git + GitHub</w:t>
-      </w:r>
-    </w:p>
-    <w:p>
-      <w:pPr>
-        <w:spacing w:before="100" w:after="100"/>
-      </w:pPr>
-    </w:p>
-    <w:p>
-      <w:pPr>
-        <w:pStyle w:val="Heading2"/>
-        <w:rPr>
-          <w:color w:val="auto"/>
-        </w:rPr>
-      </w:pPr>
-      <w:bookmarkStart w:id="11" w:name="_Toc231911473"/>
-      <w:r>
-        <w:rPr>
-          <w:rFonts w:ascii="Arial" w:eastAsia="Arial" w:hAnsi="Arial" w:cs="Arial"/>
-          <w:b/>
-          <w:bCs/>
-          <w:color w:val="auto"/>
-          <w:sz w:val="26"/>
-          <w:szCs w:val="26"/>
-        </w:rPr>
-        <w:t>Personal Reflection</w:t>
-      </w:r>
-      <w:bookmarkEnd w:id="11"/>
-    </w:p>
-    <w:p>
-      <w:pPr>
-        <w:spacing w:before="100" w:after="100"/>
-      </w:pPr>
-    </w:p>
-    <w:p>
-      <w:r>
-        <w:t>T</w:t>
-      </w:r>
-      <w:r>
-        <w:t>his week I integrated Firebase into DukaStock and built working authentication. The key challenge was a package name mismatch between Firebase and Flutter which caused a Gradle build failure. I resolved it by registering a new Android app in Firebase with the exact package name from build.gradle.kts</w:t>
-      </w:r>
-      <w:r>
-        <w:br w:type="page"/>
-      </w:r>
-    </w:p>
-    <w:p>
-      <w:pPr>
-        <w:pStyle w:val="Heading1"/>
-        <w:pBdr>
-          <w:bottom w:val="single" w:sz="8" w:space="1" w:color="1B5E20"/>
-        </w:pBdr>
-        <w:rPr>
-          <w:color w:val="auto"/>
-        </w:rPr>
-      </w:pPr>
-      <w:bookmarkStart w:id="12" w:name="_Toc231911474"/>
-      <w:r>
-        <w:rPr>
-          <w:rFonts w:ascii="Arial" w:eastAsia="Arial" w:hAnsi="Arial" w:cs="Arial"/>
-          <w:b/>
-          <w:bCs/>
-          <w:color w:val="auto"/>
-          <w:sz w:val="32"/>
-          <w:szCs w:val="32"/>
-        </w:rPr>
-        <w:lastRenderedPageBreak/>
-        <w:t>Week 3: User Interface Design</w:t>
-      </w:r>
-      <w:bookmarkEnd w:id="12"/>
-    </w:p>
-    <w:p>
-      <w:pPr>
-        <w:spacing w:before="100" w:after="100"/>
-      </w:pPr>
-    </w:p>
-    <w:p>
-      <w:pPr>
-        <w:pStyle w:val="Heading2"/>
-        <w:rPr>
-          <w:color w:val="auto"/>
-        </w:rPr>
-      </w:pPr>
-      <w:bookmarkStart w:id="13" w:name="_Toc231911475"/>
-      <w:r>
-        <w:rPr>
-          <w:rFonts w:ascii="Arial" w:eastAsia="Arial" w:hAnsi="Arial" w:cs="Arial"/>
-          <w:b/>
-          <w:bCs/>
-          <w:color w:val="auto"/>
-          <w:sz w:val="26"/>
-          <w:szCs w:val="26"/>
-        </w:rPr>
-        <w:t>Practical Activities Undertaken</w:t>
-      </w:r>
-      <w:bookmarkEnd w:id="13"/>
-    </w:p>
-    <w:p>
-      <w:pPr>
-        <w:spacing w:before="100" w:after="100"/>
-      </w:pPr>
-    </w:p>
-    <w:p>
-      <w:pPr>
-        <w:pStyle w:val="ListParagraph"/>
-        <w:numPr>
-          <w:ilvl w:val="0"/>
-          <w:numId w:val="2"/>
-        </w:numPr>
-        <w:spacing w:before="60" w:after="60"/>
-        <w:contextualSpacing w:val="0"/>
-      </w:pPr>
-      <w:r>
-        <w:t>Created DukaStock UI project in Figma for professional wireframe design</w:t>
-      </w:r>
-    </w:p>
-    <w:p>
-      <w:pPr>
-        <w:pStyle w:val="ListParagraph"/>
-        <w:numPr>
-          <w:ilvl w:val="0"/>
-          <w:numId w:val="2"/>
-        </w:numPr>
-        <w:spacing w:before="60" w:after="60"/>
-        <w:contextualSpacing w:val="0"/>
-      </w:pPr>
-      <w:r>
-        <w:t>Designed Login screen wireframe in Figma with DukaStock branding, email/password fields, Log In / Register tabs, and green button</w:t>
-      </w:r>
-    </w:p>
-    <w:p>
-      <w:pPr>
-        <w:pStyle w:val="ListParagraph"/>
-        <w:numPr>
-          <w:ilvl w:val="0"/>
-          <w:numId w:val="2"/>
-        </w:numPr>
-        <w:spacing w:before="60" w:after="60"/>
-        <w:contextualSpacing w:val="0"/>
-      </w:pPr>
-      <w:r>
-        <w:t>Designed Register screen wireframe with Full Name, Email, Password fields and Retailer/Wholesaler role selector tabs</w:t>
-      </w:r>
-    </w:p>
-    <w:p>
-      <w:pPr>
-        <w:pStyle w:val="ListParagraph"/>
-        <w:numPr>
-          <w:ilvl w:val="0"/>
-          <w:numId w:val="2"/>
-        </w:numPr>
-        <w:spacing w:before="60" w:after="60"/>
-        <w:contextualSpacing w:val="0"/>
-      </w:pPr>
-      <w:r>
-        <w:t>Designed Reset Password screen with new password and confirm password fields</w:t>
-      </w:r>
-    </w:p>
-    <w:p>
-      <w:pPr>
-        <w:pStyle w:val="ListParagraph"/>
-        <w:numPr>
-          <w:ilvl w:val="0"/>
-          <w:numId w:val="2"/>
-        </w:numPr>
-        <w:spacing w:before="60" w:after="60"/>
-        <w:contextualSpacing w:val="0"/>
-      </w:pPr>
-      <w:r>
-        <w:t>Designed Retailer Dashboard wireframe with green app bar, welcome banner, and 4 menu cards grid</w:t>
-      </w:r>
-    </w:p>
-    <w:p>
-      <w:pPr>
-        <w:pStyle w:val="ListParagraph"/>
-        <w:numPr>
-          <w:ilvl w:val="0"/>
-          <w:numId w:val="2"/>
-        </w:numPr>
-        <w:spacing w:before="60" w:after="60"/>
-        <w:contextualSpacing w:val="0"/>
-      </w:pPr>
-      <w:r>
-        <w:t>Designed Wholesaler Dashboard wireframe with different role-specific menu cards</w:t>
-      </w:r>
-    </w:p>
-    <w:p>
-      <w:pPr>
-        <w:pStyle w:val="ListParagraph"/>
-        <w:numPr>
-          <w:ilvl w:val="0"/>
-          <w:numId w:val="2"/>
-        </w:numPr>
-        <w:spacing w:before="60" w:after="60"/>
-        <w:contextualSpacing w:val="0"/>
-      </w:pPr>
-      <w:r>
-        <w:t>Designed Product Catalog screen with search bar and product listing cards</w:t>
-      </w:r>
-    </w:p>
-    <w:p>
-      <w:pPr>
-        <w:pStyle w:val="ListParagraph"/>
-        <w:numPr>
-          <w:ilvl w:val="0"/>
-          <w:numId w:val="2"/>
-        </w:numPr>
-        <w:spacing w:before="60" w:after="60"/>
-        <w:contextualSpacing w:val="0"/>
-      </w:pPr>
-      <w:r>
-        <w:t>Converted Figma Login design to Flutter code with improved UI components</w:t>
-      </w:r>
-    </w:p>
-    <w:p>
-      <w:pPr>
-        <w:pStyle w:val="ListParagraph"/>
-        <w:numPr>
-          <w:ilvl w:val="0"/>
-          <w:numId w:val="2"/>
-        </w:numPr>
-        <w:spacing w:before="60" w:after="60"/>
-        <w:contextualSpacing w:val="0"/>
-      </w:pPr>
-      <w:r>
-        <w:t>Converted Figma Register design to Flutter code with visual role selector cards</w:t>
-      </w:r>
-    </w:p>
-    <w:p>
-      <w:pPr>
-        <w:pStyle w:val="ListParagraph"/>
-        <w:numPr>
-          <w:ilvl w:val="0"/>
-          <w:numId w:val="2"/>
-        </w:numPr>
-        <w:spacing w:before="60" w:after="60"/>
-        <w:contextualSpacing w:val="0"/>
-      </w:pPr>
-      <w:r>
-        <w:t>Added form validation for all input fields — empty field checks and email format validation</w:t>
-      </w:r>
-    </w:p>
-    <w:p>
-      <w:pPr>
-        <w:pStyle w:val="ListParagraph"/>
-        <w:numPr>
-          <w:ilvl w:val="0"/>
-          <w:numId w:val="2"/>
-        </w:numPr>
-        <w:spacing w:before="60" w:after="60"/>
-        <w:contextualSpacing w:val="0"/>
-      </w:pPr>
-      <w:r>
-        <w:t>Implemented page transition animations between screens</w:t>
-      </w:r>
-    </w:p>
-    <w:p>
-      <w:pPr>
-        <w:pStyle w:val="ListParagraph"/>
-        <w:numPr>
-          <w:ilvl w:val="0"/>
-          <w:numId w:val="2"/>
-        </w:numPr>
-        <w:spacing w:before="60" w:after="60"/>
-        <w:contextualSpacing w:val="0"/>
-      </w:pPr>
-      <w:r>
-        <w:t>Tested all screens on Redmi Note 14 and verified navigation flow works correctly</w:t>
-      </w:r>
-    </w:p>
-    <w:p>
-      <w:pPr>
-        <w:pStyle w:val="ListParagraph"/>
-        <w:numPr>
-          <w:ilvl w:val="0"/>
-          <w:numId w:val="2"/>
-        </w:numPr>
-        <w:spacing w:before="60" w:after="60"/>
-        <w:contextualSpacing w:val="0"/>
-      </w:pPr>
-      <w:r>
-        <w:t>Pushed all Week 3 UI improvements to GitHub</w:t>
-      </w:r>
-    </w:p>
-    <w:p>
-      <w:pPr>
-        <w:spacing w:before="100" w:after="100"/>
-      </w:pPr>
-    </w:p>
-    <w:p>
-      <w:pPr>
-        <w:pStyle w:val="Heading2"/>
-        <w:rPr>
-          <w:color w:val="auto"/>
-        </w:rPr>
-      </w:pPr>
-      <w:bookmarkStart w:id="14" w:name="_Toc231911476"/>
-      <w:r>
-        <w:rPr>
-          <w:rFonts w:ascii="Arial" w:eastAsia="Arial" w:hAnsi="Arial" w:cs="Arial"/>
-          <w:b/>
-          <w:bCs/>
-          <w:color w:val="auto"/>
-          <w:sz w:val="26"/>
-          <w:szCs w:val="26"/>
-        </w:rPr>
-        <w:t>Screenshots / Evidence Attached</w:t>
-      </w:r>
-      <w:bookmarkEnd w:id="14"/>
-    </w:p>
-    <w:p>
-      <w:pPr>
-        <w:spacing w:before="100" w:after="100"/>
-      </w:pPr>
-    </w:p>
-    <w:p>
-      <w:pPr>
-        <w:spacing w:before="80" w:after="80"/>
-      </w:pPr>
-      <w:r>
-        <w:rPr>
-          <w:b/>
-          <w:bCs/>
-        </w:rPr>
-        <w:t>Screenshots Attached: Yes</w:t>
-      </w:r>
-    </w:p>
     <w:p>
       <w:pPr>
         <w:spacing w:before="100" w:after="100"/>
@@ -6754,12 +6568,6 @@
         <w:gridCol w:w="9360"/>
       </w:tblGrid>
       <w:tr>
-        <w:tblPrEx>
-          <w:tblCellMar>
-            <w:top w:w="0" w:type="dxa"/>
-            <w:bottom w:w="0" w:type="dxa"/>
-          </w:tblCellMar>
-        </w:tblPrEx>
         <w:tc>
           <w:tcPr>
             <w:tcW w:w="9360" w:type="dxa"/>
@@ -6781,7 +6589,6 @@
             <w:pPr>
               <w:jc w:val="center"/>
             </w:pPr>
-            <w:proofErr w:type="gramStart"/>
             <w:r>
               <w:rPr>
                 <w:rFonts w:ascii="Segoe UI Emoji" w:hAnsi="Segoe UI Emoji" w:cs="Segoe UI Emoji"/>
@@ -6795,15 +6602,7 @@
                 <w:b/>
                 <w:bCs/>
               </w:rPr>
-              <w:t xml:space="preserve">  INSERT</w:t>
-            </w:r>
-            <w:proofErr w:type="gramEnd"/>
-            <w:r>
-              <w:rPr>
-                <w:b/>
-                <w:bCs/>
-              </w:rPr>
-              <w:t xml:space="preserve"> SCREENSHOT HERE</w:t>
+              <w:t xml:space="preserve">  INSERT SCREENSHOT HERE</w:t>
             </w:r>
           </w:p>
           <w:p>
@@ -6817,7 +6616,7 @@
                 <w:sz w:val="20"/>
                 <w:szCs w:val="20"/>
               </w:rPr>
-              <w:t>Screenshot 26: Figma workspace showing DukaStock Login screen wireframe</w:t>
+              <w:t>Screenshot 31: Improved Login screen running on Redmi Note 14</w:t>
             </w:r>
           </w:p>
         </w:tc>
@@ -6849,12 +6648,6 @@
         <w:gridCol w:w="9360"/>
       </w:tblGrid>
       <w:tr>
-        <w:tblPrEx>
-          <w:tblCellMar>
-            <w:top w:w="0" w:type="dxa"/>
-            <w:bottom w:w="0" w:type="dxa"/>
-          </w:tblCellMar>
-        </w:tblPrEx>
         <w:tc>
           <w:tcPr>
             <w:tcW w:w="9360" w:type="dxa"/>
@@ -6876,7 +6669,6 @@
             <w:pPr>
               <w:jc w:val="center"/>
             </w:pPr>
-            <w:proofErr w:type="gramStart"/>
             <w:r>
               <w:rPr>
                 <w:rFonts w:ascii="Segoe UI Emoji" w:hAnsi="Segoe UI Emoji" w:cs="Segoe UI Emoji"/>
@@ -6890,15 +6682,7 @@
                 <w:b/>
                 <w:bCs/>
               </w:rPr>
-              <w:t xml:space="preserve">  INSERT</w:t>
-            </w:r>
-            <w:proofErr w:type="gramEnd"/>
-            <w:r>
-              <w:rPr>
-                <w:b/>
-                <w:bCs/>
-              </w:rPr>
-              <w:t xml:space="preserve"> SCREENSHOT HERE</w:t>
+              <w:t xml:space="preserve">  INSERT SCREENSHOT HERE</w:t>
             </w:r>
           </w:p>
           <w:p>
@@ -6912,7 +6696,7 @@
                 <w:sz w:val="20"/>
                 <w:szCs w:val="20"/>
               </w:rPr>
-              <w:t>Screenshot 27: Figma workspace showing Register screen with Retailer/Wholesaler selector</w:t>
+              <w:t>Screenshot 32: Improved Register screen with role cards on Redmi Note 14</w:t>
             </w:r>
           </w:p>
         </w:tc>
@@ -6944,12 +6728,6 @@
         <w:gridCol w:w="9360"/>
       </w:tblGrid>
       <w:tr>
-        <w:tblPrEx>
-          <w:tblCellMar>
-            <w:top w:w="0" w:type="dxa"/>
-            <w:bottom w:w="0" w:type="dxa"/>
-          </w:tblCellMar>
-        </w:tblPrEx>
         <w:tc>
           <w:tcPr>
             <w:tcW w:w="9360" w:type="dxa"/>
@@ -6971,7 +6749,6 @@
             <w:pPr>
               <w:jc w:val="center"/>
             </w:pPr>
-            <w:proofErr w:type="gramStart"/>
             <w:r>
               <w:rPr>
                 <w:rFonts w:ascii="Segoe UI Emoji" w:hAnsi="Segoe UI Emoji" w:cs="Segoe UI Emoji"/>
@@ -6985,491 +6762,7 @@
                 <w:b/>
                 <w:bCs/>
               </w:rPr>
-              <w:t xml:space="preserve">  INSERT</w:t>
-            </w:r>
-            <w:proofErr w:type="gramEnd"/>
-            <w:r>
-              <w:rPr>
-                <w:b/>
-                <w:bCs/>
-              </w:rPr>
-              <w:t xml:space="preserve"> SCREENSHOT HERE</w:t>
-            </w:r>
-          </w:p>
-          <w:p>
-            <w:pPr>
-              <w:jc w:val="center"/>
-            </w:pPr>
-            <w:r>
-              <w:rPr>
-                <w:i/>
-                <w:iCs/>
-                <w:sz w:val="20"/>
-                <w:szCs w:val="20"/>
-              </w:rPr>
-              <w:t>Screenshot 28: Figma workspace showing Reset Password screen</w:t>
-            </w:r>
-          </w:p>
-        </w:tc>
-      </w:tr>
-    </w:tbl>
-    <w:p>
-      <w:pPr>
-        <w:spacing w:before="100" w:after="100"/>
-      </w:pPr>
-    </w:p>
-    <w:tbl>
-      <w:tblPr>
-        <w:tblW w:w="9360" w:type="dxa"/>
-        <w:tblBorders>
-          <w:top w:val="single" w:sz="4" w:space="0" w:color="auto"/>
-          <w:left w:val="single" w:sz="4" w:space="0" w:color="auto"/>
-          <w:bottom w:val="single" w:sz="4" w:space="0" w:color="auto"/>
-          <w:right w:val="single" w:sz="4" w:space="0" w:color="auto"/>
-          <w:insideH w:val="single" w:sz="4" w:space="0" w:color="auto"/>
-          <w:insideV w:val="single" w:sz="4" w:space="0" w:color="auto"/>
-        </w:tblBorders>
-        <w:tblCellMar>
-          <w:left w:w="10" w:type="dxa"/>
-          <w:right w:w="10" w:type="dxa"/>
-        </w:tblCellMar>
-        <w:tblLook w:val="0000" w:firstRow="0" w:lastRow="0" w:firstColumn="0" w:lastColumn="0" w:noHBand="0" w:noVBand="0"/>
-      </w:tblPr>
-      <w:tblGrid>
-        <w:gridCol w:w="9360"/>
-      </w:tblGrid>
-      <w:tr>
-        <w:tblPrEx>
-          <w:tblCellMar>
-            <w:top w:w="0" w:type="dxa"/>
-            <w:bottom w:w="0" w:type="dxa"/>
-          </w:tblCellMar>
-        </w:tblPrEx>
-        <w:tc>
-          <w:tcPr>
-            <w:tcW w:w="9360" w:type="dxa"/>
-            <w:tcBorders>
-              <w:top w:val="dashed" w:sz="2" w:space="0" w:color="2E7D32"/>
-              <w:left w:val="dashed" w:sz="2" w:space="0" w:color="2E7D32"/>
-              <w:bottom w:val="dashed" w:sz="2" w:space="0" w:color="2E7D32"/>
-              <w:right w:val="dashed" w:sz="2" w:space="0" w:color="2E7D32"/>
-            </w:tcBorders>
-            <w:shd w:val="clear" w:color="auto" w:fill="F1F8E9"/>
-            <w:tcMar>
-              <w:top w:w="220" w:type="dxa"/>
-              <w:left w:w="200" w:type="dxa"/>
-              <w:bottom w:w="220" w:type="dxa"/>
-              <w:right w:w="200" w:type="dxa"/>
-            </w:tcMar>
-          </w:tcPr>
-          <w:p>
-            <w:pPr>
-              <w:jc w:val="center"/>
-            </w:pPr>
-            <w:proofErr w:type="gramStart"/>
-            <w:r>
-              <w:rPr>
-                <w:rFonts w:ascii="Segoe UI Emoji" w:hAnsi="Segoe UI Emoji" w:cs="Segoe UI Emoji"/>
-                <w:b/>
-                <w:bCs/>
-              </w:rPr>
-              <w:lastRenderedPageBreak/>
-              <w:t>📸</w:t>
-            </w:r>
-            <w:r>
-              <w:rPr>
-                <w:b/>
-                <w:bCs/>
-              </w:rPr>
-              <w:t xml:space="preserve">  INSERT</w:t>
-            </w:r>
-            <w:proofErr w:type="gramEnd"/>
-            <w:r>
-              <w:rPr>
-                <w:b/>
-                <w:bCs/>
-              </w:rPr>
-              <w:t xml:space="preserve"> SCREENSHOT HERE</w:t>
-            </w:r>
-          </w:p>
-          <w:p>
-            <w:pPr>
-              <w:jc w:val="center"/>
-            </w:pPr>
-            <w:r>
-              <w:rPr>
-                <w:i/>
-                <w:iCs/>
-                <w:sz w:val="20"/>
-                <w:szCs w:val="20"/>
-              </w:rPr>
-              <w:t>Screenshot 29: Figma workspace showing Retailer Dashboard wireframe</w:t>
-            </w:r>
-          </w:p>
-        </w:tc>
-      </w:tr>
-    </w:tbl>
-    <w:p>
-      <w:pPr>
-        <w:spacing w:before="100" w:after="100"/>
-      </w:pPr>
-    </w:p>
-    <w:tbl>
-      <w:tblPr>
-        <w:tblW w:w="9360" w:type="dxa"/>
-        <w:tblBorders>
-          <w:top w:val="single" w:sz="4" w:space="0" w:color="auto"/>
-          <w:left w:val="single" w:sz="4" w:space="0" w:color="auto"/>
-          <w:bottom w:val="single" w:sz="4" w:space="0" w:color="auto"/>
-          <w:right w:val="single" w:sz="4" w:space="0" w:color="auto"/>
-          <w:insideH w:val="single" w:sz="4" w:space="0" w:color="auto"/>
-          <w:insideV w:val="single" w:sz="4" w:space="0" w:color="auto"/>
-        </w:tblBorders>
-        <w:tblCellMar>
-          <w:left w:w="10" w:type="dxa"/>
-          <w:right w:w="10" w:type="dxa"/>
-        </w:tblCellMar>
-        <w:tblLook w:val="0000" w:firstRow="0" w:lastRow="0" w:firstColumn="0" w:lastColumn="0" w:noHBand="0" w:noVBand="0"/>
-      </w:tblPr>
-      <w:tblGrid>
-        <w:gridCol w:w="9360"/>
-      </w:tblGrid>
-      <w:tr>
-        <w:tblPrEx>
-          <w:tblCellMar>
-            <w:top w:w="0" w:type="dxa"/>
-            <w:bottom w:w="0" w:type="dxa"/>
-          </w:tblCellMar>
-        </w:tblPrEx>
-        <w:tc>
-          <w:tcPr>
-            <w:tcW w:w="9360" w:type="dxa"/>
-            <w:tcBorders>
-              <w:top w:val="dashed" w:sz="2" w:space="0" w:color="2E7D32"/>
-              <w:left w:val="dashed" w:sz="2" w:space="0" w:color="2E7D32"/>
-              <w:bottom w:val="dashed" w:sz="2" w:space="0" w:color="2E7D32"/>
-              <w:right w:val="dashed" w:sz="2" w:space="0" w:color="2E7D32"/>
-            </w:tcBorders>
-            <w:shd w:val="clear" w:color="auto" w:fill="F1F8E9"/>
-            <w:tcMar>
-              <w:top w:w="220" w:type="dxa"/>
-              <w:left w:w="200" w:type="dxa"/>
-              <w:bottom w:w="220" w:type="dxa"/>
-              <w:right w:w="200" w:type="dxa"/>
-            </w:tcMar>
-          </w:tcPr>
-          <w:p>
-            <w:pPr>
-              <w:jc w:val="center"/>
-            </w:pPr>
-            <w:proofErr w:type="gramStart"/>
-            <w:r>
-              <w:rPr>
-                <w:rFonts w:ascii="Segoe UI Emoji" w:hAnsi="Segoe UI Emoji" w:cs="Segoe UI Emoji"/>
-                <w:b/>
-                <w:bCs/>
-              </w:rPr>
-              <w:t>📸</w:t>
-            </w:r>
-            <w:r>
-              <w:rPr>
-                <w:b/>
-                <w:bCs/>
-              </w:rPr>
-              <w:t xml:space="preserve">  INSERT</w:t>
-            </w:r>
-            <w:proofErr w:type="gramEnd"/>
-            <w:r>
-              <w:rPr>
-                <w:b/>
-                <w:bCs/>
-              </w:rPr>
-              <w:t xml:space="preserve"> SCREENSHOT HERE</w:t>
-            </w:r>
-          </w:p>
-          <w:p>
-            <w:pPr>
-              <w:jc w:val="center"/>
-            </w:pPr>
-            <w:r>
-              <w:rPr>
-                <w:i/>
-                <w:iCs/>
-                <w:sz w:val="20"/>
-                <w:szCs w:val="20"/>
-              </w:rPr>
-              <w:t>Screenshot 30: Figma workspace showing all 5 screens side by side</w:t>
-            </w:r>
-          </w:p>
-        </w:tc>
-      </w:tr>
-    </w:tbl>
-    <w:p>
-      <w:pPr>
-        <w:spacing w:before="100" w:after="100"/>
-      </w:pPr>
-    </w:p>
-    <w:tbl>
-      <w:tblPr>
-        <w:tblW w:w="9360" w:type="dxa"/>
-        <w:tblBorders>
-          <w:top w:val="single" w:sz="4" w:space="0" w:color="auto"/>
-          <w:left w:val="single" w:sz="4" w:space="0" w:color="auto"/>
-          <w:bottom w:val="single" w:sz="4" w:space="0" w:color="auto"/>
-          <w:right w:val="single" w:sz="4" w:space="0" w:color="auto"/>
-          <w:insideH w:val="single" w:sz="4" w:space="0" w:color="auto"/>
-          <w:insideV w:val="single" w:sz="4" w:space="0" w:color="auto"/>
-        </w:tblBorders>
-        <w:tblCellMar>
-          <w:left w:w="10" w:type="dxa"/>
-          <w:right w:w="10" w:type="dxa"/>
-        </w:tblCellMar>
-        <w:tblLook w:val="0000" w:firstRow="0" w:lastRow="0" w:firstColumn="0" w:lastColumn="0" w:noHBand="0" w:noVBand="0"/>
-      </w:tblPr>
-      <w:tblGrid>
-        <w:gridCol w:w="9360"/>
-      </w:tblGrid>
-      <w:tr>
-        <w:tblPrEx>
-          <w:tblCellMar>
-            <w:top w:w="0" w:type="dxa"/>
-            <w:bottom w:w="0" w:type="dxa"/>
-          </w:tblCellMar>
-        </w:tblPrEx>
-        <w:tc>
-          <w:tcPr>
-            <w:tcW w:w="9360" w:type="dxa"/>
-            <w:tcBorders>
-              <w:top w:val="dashed" w:sz="2" w:space="0" w:color="2E7D32"/>
-              <w:left w:val="dashed" w:sz="2" w:space="0" w:color="2E7D32"/>
-              <w:bottom w:val="dashed" w:sz="2" w:space="0" w:color="2E7D32"/>
-              <w:right w:val="dashed" w:sz="2" w:space="0" w:color="2E7D32"/>
-            </w:tcBorders>
-            <w:shd w:val="clear" w:color="auto" w:fill="F1F8E9"/>
-            <w:tcMar>
-              <w:top w:w="220" w:type="dxa"/>
-              <w:left w:w="200" w:type="dxa"/>
-              <w:bottom w:w="220" w:type="dxa"/>
-              <w:right w:w="200" w:type="dxa"/>
-            </w:tcMar>
-          </w:tcPr>
-          <w:p>
-            <w:pPr>
-              <w:jc w:val="center"/>
-            </w:pPr>
-            <w:proofErr w:type="gramStart"/>
-            <w:r>
-              <w:rPr>
-                <w:rFonts w:ascii="Segoe UI Emoji" w:hAnsi="Segoe UI Emoji" w:cs="Segoe UI Emoji"/>
-                <w:b/>
-                <w:bCs/>
-              </w:rPr>
-              <w:t>📸</w:t>
-            </w:r>
-            <w:r>
-              <w:rPr>
-                <w:b/>
-                <w:bCs/>
-              </w:rPr>
-              <w:t xml:space="preserve">  INSERT</w:t>
-            </w:r>
-            <w:proofErr w:type="gramEnd"/>
-            <w:r>
-              <w:rPr>
-                <w:b/>
-                <w:bCs/>
-              </w:rPr>
-              <w:t xml:space="preserve"> SCREENSHOT HERE</w:t>
-            </w:r>
-          </w:p>
-          <w:p>
-            <w:pPr>
-              <w:jc w:val="center"/>
-            </w:pPr>
-            <w:r>
-              <w:rPr>
-                <w:i/>
-                <w:iCs/>
-                <w:sz w:val="20"/>
-                <w:szCs w:val="20"/>
-              </w:rPr>
-              <w:t>Screenshot 31: Improved Login screen running on Redmi Note 14</w:t>
-            </w:r>
-          </w:p>
-        </w:tc>
-      </w:tr>
-    </w:tbl>
-    <w:p>
-      <w:pPr>
-        <w:spacing w:before="100" w:after="100"/>
-      </w:pPr>
-    </w:p>
-    <w:tbl>
-      <w:tblPr>
-        <w:tblW w:w="9360" w:type="dxa"/>
-        <w:tblBorders>
-          <w:top w:val="single" w:sz="4" w:space="0" w:color="auto"/>
-          <w:left w:val="single" w:sz="4" w:space="0" w:color="auto"/>
-          <w:bottom w:val="single" w:sz="4" w:space="0" w:color="auto"/>
-          <w:right w:val="single" w:sz="4" w:space="0" w:color="auto"/>
-          <w:insideH w:val="single" w:sz="4" w:space="0" w:color="auto"/>
-          <w:insideV w:val="single" w:sz="4" w:space="0" w:color="auto"/>
-        </w:tblBorders>
-        <w:tblCellMar>
-          <w:left w:w="10" w:type="dxa"/>
-          <w:right w:w="10" w:type="dxa"/>
-        </w:tblCellMar>
-        <w:tblLook w:val="0000" w:firstRow="0" w:lastRow="0" w:firstColumn="0" w:lastColumn="0" w:noHBand="0" w:noVBand="0"/>
-      </w:tblPr>
-      <w:tblGrid>
-        <w:gridCol w:w="9360"/>
-      </w:tblGrid>
-      <w:tr>
-        <w:tblPrEx>
-          <w:tblCellMar>
-            <w:top w:w="0" w:type="dxa"/>
-            <w:bottom w:w="0" w:type="dxa"/>
-          </w:tblCellMar>
-        </w:tblPrEx>
-        <w:tc>
-          <w:tcPr>
-            <w:tcW w:w="9360" w:type="dxa"/>
-            <w:tcBorders>
-              <w:top w:val="dashed" w:sz="2" w:space="0" w:color="2E7D32"/>
-              <w:left w:val="dashed" w:sz="2" w:space="0" w:color="2E7D32"/>
-              <w:bottom w:val="dashed" w:sz="2" w:space="0" w:color="2E7D32"/>
-              <w:right w:val="dashed" w:sz="2" w:space="0" w:color="2E7D32"/>
-            </w:tcBorders>
-            <w:shd w:val="clear" w:color="auto" w:fill="F1F8E9"/>
-            <w:tcMar>
-              <w:top w:w="220" w:type="dxa"/>
-              <w:left w:w="200" w:type="dxa"/>
-              <w:bottom w:w="220" w:type="dxa"/>
-              <w:right w:w="200" w:type="dxa"/>
-            </w:tcMar>
-          </w:tcPr>
-          <w:p>
-            <w:pPr>
-              <w:jc w:val="center"/>
-            </w:pPr>
-            <w:proofErr w:type="gramStart"/>
-            <w:r>
-              <w:rPr>
-                <w:rFonts w:ascii="Segoe UI Emoji" w:hAnsi="Segoe UI Emoji" w:cs="Segoe UI Emoji"/>
-                <w:b/>
-                <w:bCs/>
-              </w:rPr>
-              <w:t>📸</w:t>
-            </w:r>
-            <w:r>
-              <w:rPr>
-                <w:b/>
-                <w:bCs/>
-              </w:rPr>
-              <w:t xml:space="preserve">  INSERT</w:t>
-            </w:r>
-            <w:proofErr w:type="gramEnd"/>
-            <w:r>
-              <w:rPr>
-                <w:b/>
-                <w:bCs/>
-              </w:rPr>
-              <w:t xml:space="preserve"> SCREENSHOT HERE</w:t>
-            </w:r>
-          </w:p>
-          <w:p>
-            <w:pPr>
-              <w:jc w:val="center"/>
-            </w:pPr>
-            <w:r>
-              <w:rPr>
-                <w:i/>
-                <w:iCs/>
-                <w:sz w:val="20"/>
-                <w:szCs w:val="20"/>
-              </w:rPr>
-              <w:t>Screenshot 32: Improved Register screen with role cards on Redmi Note 14</w:t>
-            </w:r>
-          </w:p>
-        </w:tc>
-      </w:tr>
-    </w:tbl>
-    <w:p>
-      <w:pPr>
-        <w:spacing w:before="100" w:after="100"/>
-      </w:pPr>
-    </w:p>
-    <w:tbl>
-      <w:tblPr>
-        <w:tblW w:w="9360" w:type="dxa"/>
-        <w:tblBorders>
-          <w:top w:val="single" w:sz="4" w:space="0" w:color="auto"/>
-          <w:left w:val="single" w:sz="4" w:space="0" w:color="auto"/>
-          <w:bottom w:val="single" w:sz="4" w:space="0" w:color="auto"/>
-          <w:right w:val="single" w:sz="4" w:space="0" w:color="auto"/>
-          <w:insideH w:val="single" w:sz="4" w:space="0" w:color="auto"/>
-          <w:insideV w:val="single" w:sz="4" w:space="0" w:color="auto"/>
-        </w:tblBorders>
-        <w:tblCellMar>
-          <w:left w:w="10" w:type="dxa"/>
-          <w:right w:w="10" w:type="dxa"/>
-        </w:tblCellMar>
-        <w:tblLook w:val="0000" w:firstRow="0" w:lastRow="0" w:firstColumn="0" w:lastColumn="0" w:noHBand="0" w:noVBand="0"/>
-      </w:tblPr>
-      <w:tblGrid>
-        <w:gridCol w:w="9360"/>
-      </w:tblGrid>
-      <w:tr>
-        <w:tblPrEx>
-          <w:tblCellMar>
-            <w:top w:w="0" w:type="dxa"/>
-            <w:bottom w:w="0" w:type="dxa"/>
-          </w:tblCellMar>
-        </w:tblPrEx>
-        <w:tc>
-          <w:tcPr>
-            <w:tcW w:w="9360" w:type="dxa"/>
-            <w:tcBorders>
-              <w:top w:val="dashed" w:sz="2" w:space="0" w:color="2E7D32"/>
-              <w:left w:val="dashed" w:sz="2" w:space="0" w:color="2E7D32"/>
-              <w:bottom w:val="dashed" w:sz="2" w:space="0" w:color="2E7D32"/>
-              <w:right w:val="dashed" w:sz="2" w:space="0" w:color="2E7D32"/>
-            </w:tcBorders>
-            <w:shd w:val="clear" w:color="auto" w:fill="F1F8E9"/>
-            <w:tcMar>
-              <w:top w:w="220" w:type="dxa"/>
-              <w:left w:w="200" w:type="dxa"/>
-              <w:bottom w:w="220" w:type="dxa"/>
-              <w:right w:w="200" w:type="dxa"/>
-            </w:tcMar>
-          </w:tcPr>
-          <w:p>
-            <w:pPr>
-              <w:jc w:val="center"/>
-            </w:pPr>
-            <w:proofErr w:type="gramStart"/>
-            <w:r>
-              <w:rPr>
-                <w:rFonts w:ascii="Segoe UI Emoji" w:hAnsi="Segoe UI Emoji" w:cs="Segoe UI Emoji"/>
-                <w:b/>
-                <w:bCs/>
-              </w:rPr>
-              <w:t>📸</w:t>
-            </w:r>
-            <w:r>
-              <w:rPr>
-                <w:b/>
-                <w:bCs/>
-              </w:rPr>
-              <w:t xml:space="preserve">  INSERT</w:t>
-            </w:r>
-            <w:proofErr w:type="gramEnd"/>
-            <w:r>
-              <w:rPr>
-                <w:b/>
-                <w:bCs/>
-              </w:rPr>
-              <w:t xml:space="preserve"> SCREENSHOT HERE</w:t>
+              <w:t xml:space="preserve">  INSERT SCREENSHOT HERE</w:t>
             </w:r>
           </w:p>
           <w:p>
@@ -8443,7 +7736,6 @@
   <w:style w:type="character" w:default="1" w:styleId="DefaultParagraphFont">
     <w:name w:val="Default Paragraph Font"/>
     <w:uiPriority w:val="1"/>
-    <w:semiHidden/>
     <w:unhideWhenUsed/>
   </w:style>
   <w:style w:type="table" w:default="1" w:styleId="TableNormal">

</xml_diff>

<commit_message>
Update documentation with Week 3 Figma designs and recent changes
</commit_message>
<xml_diff>
--- a/Documentation of dukastock.docx
+++ b/Documentation of dukastock.docx
@@ -83,8 +83,6 @@
       </w:pPr>
       <w:r>
         <w:rPr>
-          <w:i/>
-          <w:iCs/>
           <w:sz w:val="24"/>
           <w:szCs w:val="24"/>
         </w:rPr>
@@ -404,6 +402,7 @@
             <w:pPr>
               <w:shd w:val="clear" w:color="auto" w:fill="FFFFFF" w:themeFill="background1"/>
             </w:pPr>
+            <w:proofErr w:type="spellStart"/>
             <w:r>
               <w:rPr>
                 <w:b/>
@@ -411,6 +410,7 @@
               </w:rPr>
               <w:t>Programme</w:t>
             </w:r>
+            <w:proofErr w:type="spellEnd"/>
           </w:p>
         </w:tc>
         <w:tc>
@@ -2431,7 +2431,20 @@
         <w:contextualSpacing w:val="0"/>
       </w:pPr>
       <w:r>
-        <w:t>Created a GitHub account and set up the DukaStock repository with Flutter .gitignore and README</w:t>
+        <w:t xml:space="preserve">Created a GitHub account and set up the DukaStock repository with </w:t>
+      </w:r>
+      <w:proofErr w:type="gramStart"/>
+      <w:r>
+        <w:t>Flutter .</w:t>
+      </w:r>
+      <w:proofErr w:type="spellStart"/>
+      <w:r>
+        <w:t>gitignore</w:t>
+      </w:r>
+      <w:proofErr w:type="spellEnd"/>
+      <w:proofErr w:type="gramEnd"/>
+      <w:r>
+        <w:t xml:space="preserve"> and README</w:t>
       </w:r>
     </w:p>
     <w:p>
@@ -2501,7 +2514,15 @@
         <w:contextualSpacing w:val="0"/>
       </w:pPr>
       <w:r>
-        <w:t>Created and configured a Pixel 6 Android Virtual Device with API 37 (Android 17.0 CinnamonBun)</w:t>
+        <w:t xml:space="preserve">Created and configured a Pixel 6 Android Virtual Device with API 37 (Android 17.0 </w:t>
+      </w:r>
+      <w:proofErr w:type="spellStart"/>
+      <w:r>
+        <w:t>CinnamonBun</w:t>
+      </w:r>
+      <w:proofErr w:type="spellEnd"/>
+      <w:r>
+        <w:t>)</w:t>
       </w:r>
     </w:p>
     <w:p>
@@ -2515,7 +2536,17 @@
         <w:contextualSpacing w:val="0"/>
       </w:pPr>
       <w:r>
-        <w:t>Customized main.dart — changed app title to DukaStock, theme color to green, added Welcome to DukaStock! text</w:t>
+        <w:t xml:space="preserve">Customized </w:t>
+      </w:r>
+      <w:proofErr w:type="spellStart"/>
+      <w:proofErr w:type="gramStart"/>
+      <w:r>
+        <w:t>main.dart</w:t>
+      </w:r>
+      <w:proofErr w:type="spellEnd"/>
+      <w:proofErr w:type="gramEnd"/>
+      <w:r>
+        <w:t xml:space="preserve"> — changed app title to DukaStock, theme color to green, added Welcome to DukaStock! text</w:t>
       </w:r>
     </w:p>
     <w:p>
@@ -2636,8 +2667,6 @@
             <w:pPr>
               <w:jc w:val="center"/>
               <w:rPr>
-                <w:i/>
-                <w:iCs/>
                 <w:sz w:val="20"/>
                 <w:szCs w:val="20"/>
               </w:rPr>
@@ -2702,8 +2731,6 @@
             </w:pPr>
             <w:r>
               <w:rPr>
-                <w:i/>
-                <w:iCs/>
                 <w:sz w:val="20"/>
                 <w:szCs w:val="20"/>
               </w:rPr>
@@ -2760,16 +2787,12 @@
             <w:pPr>
               <w:jc w:val="center"/>
               <w:rPr>
-                <w:i/>
-                <w:iCs/>
                 <w:sz w:val="20"/>
                 <w:szCs w:val="20"/>
               </w:rPr>
             </w:pPr>
             <w:r>
               <w:rPr>
-                <w:i/>
-                <w:iCs/>
                 <w:noProof/>
                 <w:sz w:val="20"/>
                 <w:szCs w:val="20"/>
@@ -2828,8 +2851,6 @@
             <w:pPr>
               <w:jc w:val="center"/>
               <w:rPr>
-                <w:i/>
-                <w:iCs/>
                 <w:sz w:val="20"/>
                 <w:szCs w:val="20"/>
               </w:rPr>
@@ -2841,8 +2862,6 @@
             </w:pPr>
             <w:r>
               <w:rPr>
-                <w:i/>
-                <w:iCs/>
                 <w:sz w:val="20"/>
                 <w:szCs w:val="20"/>
               </w:rPr>
@@ -2899,6 +2918,7 @@
             <w:pPr>
               <w:jc w:val="center"/>
             </w:pPr>
+            <w:proofErr w:type="gramStart"/>
             <w:r>
               <w:rPr>
                 <w:rFonts w:ascii="Segoe UI Emoji" w:hAnsi="Segoe UI Emoji" w:cs="Segoe UI Emoji"/>
@@ -2912,7 +2932,15 @@
                 <w:b/>
                 <w:bCs/>
               </w:rPr>
-              <w:t xml:space="preserve">  INSERT SCREENSHOT HERE</w:t>
+              <w:t xml:space="preserve">  INSERT</w:t>
+            </w:r>
+            <w:proofErr w:type="gramEnd"/>
+            <w:r>
+              <w:rPr>
+                <w:b/>
+                <w:bCs/>
+              </w:rPr>
+              <w:t xml:space="preserve"> SCREENSHOT HERE</w:t>
             </w:r>
           </w:p>
           <w:p>
@@ -2921,8 +2949,6 @@
             </w:pPr>
             <w:r>
               <w:rPr>
-                <w:i/>
-                <w:iCs/>
                 <w:sz w:val="20"/>
                 <w:szCs w:val="20"/>
               </w:rPr>
@@ -2979,8 +3005,6 @@
             <w:pPr>
               <w:jc w:val="center"/>
               <w:rPr>
-                <w:i/>
-                <w:iCs/>
                 <w:sz w:val="20"/>
                 <w:szCs w:val="20"/>
               </w:rPr>
@@ -3047,8 +3071,6 @@
             </w:pPr>
             <w:r>
               <w:rPr>
-                <w:i/>
-                <w:iCs/>
                 <w:sz w:val="20"/>
                 <w:szCs w:val="20"/>
               </w:rPr>
@@ -3108,23 +3130,19 @@
             <w:pPr>
               <w:jc w:val="center"/>
               <w:rPr>
-                <w:i/>
-                <w:iCs/>
                 <w:sz w:val="20"/>
                 <w:szCs w:val="20"/>
               </w:rPr>
             </w:pPr>
             <w:r>
               <w:rPr>
-                <w:i/>
-                <w:iCs/>
                 <w:noProof/>
                 <w:sz w:val="20"/>
                 <w:szCs w:val="20"/>
               </w:rPr>
               <w:lastRenderedPageBreak/>
               <w:drawing>
-                <wp:inline distT="0" distB="0" distL="0" distR="0" wp14:anchorId="58DDD8FC" wp14:editId="3C3DA6CF">
+                <wp:inline distT="0" distB="0" distL="0" distR="0" wp14:anchorId="58DDD8FC" wp14:editId="1394C2D8">
                   <wp:extent cx="2197100" cy="2482850"/>
                   <wp:effectExtent l="0" t="0" r="0" b="0"/>
                   <wp:docPr id="990472966" name="Picture 4"/>
@@ -3177,8 +3195,6 @@
             <w:pPr>
               <w:jc w:val="center"/>
               <w:rPr>
-                <w:i/>
-                <w:iCs/>
                 <w:sz w:val="20"/>
                 <w:szCs w:val="20"/>
               </w:rPr>
@@ -3190,8 +3206,6 @@
             </w:pPr>
             <w:r>
               <w:rPr>
-                <w:i/>
-                <w:iCs/>
                 <w:sz w:val="20"/>
                 <w:szCs w:val="20"/>
               </w:rPr>
@@ -3248,6 +3262,7 @@
             <w:pPr>
               <w:jc w:val="center"/>
             </w:pPr>
+            <w:proofErr w:type="gramStart"/>
             <w:r>
               <w:rPr>
                 <w:rFonts w:ascii="Segoe UI Emoji" w:hAnsi="Segoe UI Emoji" w:cs="Segoe UI Emoji"/>
@@ -3261,7 +3276,15 @@
                 <w:b/>
                 <w:bCs/>
               </w:rPr>
-              <w:t xml:space="preserve">  INSERT SCREENSHOT HERE</w:t>
+              <w:t xml:space="preserve">  INSERT</w:t>
+            </w:r>
+            <w:proofErr w:type="gramEnd"/>
+            <w:r>
+              <w:rPr>
+                <w:b/>
+                <w:bCs/>
+              </w:rPr>
+              <w:t xml:space="preserve"> SCREENSHOT HERE</w:t>
             </w:r>
           </w:p>
           <w:p>
@@ -3270,8 +3293,6 @@
             </w:pPr>
             <w:r>
               <w:rPr>
-                <w:i/>
-                <w:iCs/>
                 <w:sz w:val="20"/>
                 <w:szCs w:val="20"/>
               </w:rPr>
@@ -3328,16 +3349,12 @@
             <w:pPr>
               <w:jc w:val="center"/>
               <w:rPr>
-                <w:i/>
-                <w:iCs/>
                 <w:sz w:val="20"/>
                 <w:szCs w:val="20"/>
               </w:rPr>
             </w:pPr>
             <w:r>
               <w:rPr>
-                <w:i/>
-                <w:iCs/>
                 <w:noProof/>
                 <w:sz w:val="20"/>
                 <w:szCs w:val="20"/>
@@ -3396,8 +3413,6 @@
             <w:pPr>
               <w:jc w:val="center"/>
               <w:rPr>
-                <w:i/>
-                <w:iCs/>
                 <w:sz w:val="20"/>
                 <w:szCs w:val="20"/>
               </w:rPr>
@@ -3409,13 +3424,22 @@
             </w:pPr>
             <w:r>
               <w:rPr>
-                <w:i/>
-                <w:iCs/>
                 <w:sz w:val="20"/>
                 <w:szCs w:val="20"/>
               </w:rPr>
-              <w:t>Screenshot 7: Android Studio showing DukaStock project structure and main.dart</w:t>
-            </w:r>
+              <w:t xml:space="preserve">Screenshot 7: Android Studio showing DukaStock project structure and </w:t>
+            </w:r>
+            <w:proofErr w:type="spellStart"/>
+            <w:proofErr w:type="gramStart"/>
+            <w:r>
+              <w:rPr>
+                <w:sz w:val="20"/>
+                <w:szCs w:val="20"/>
+              </w:rPr>
+              <w:t>main.dart</w:t>
+            </w:r>
+            <w:proofErr w:type="spellEnd"/>
+            <w:proofErr w:type="gramEnd"/>
           </w:p>
         </w:tc>
       </w:tr>
@@ -3543,8 +3567,6 @@
               <w:rPr>
                 <w:b/>
                 <w:bCs/>
-                <w:i/>
-                <w:iCs/>
                 <w:sz w:val="20"/>
                 <w:szCs w:val="20"/>
               </w:rPr>
@@ -3556,8 +3578,6 @@
             </w:pPr>
             <w:r>
               <w:rPr>
-                <w:i/>
-                <w:iCs/>
                 <w:sz w:val="20"/>
                 <w:szCs w:val="20"/>
               </w:rPr>
@@ -3672,12 +3692,28 @@
             </w:pPr>
             <w:r>
               <w:rPr>
-                <w:i/>
-                <w:iCs/>
                 <w:sz w:val="20"/>
                 <w:szCs w:val="20"/>
               </w:rPr>
-              <w:t>Screenshot 9: Customized main.dart code in Android Studio</w:t>
+              <w:t xml:space="preserve">Screenshot 9: Customized </w:t>
+            </w:r>
+            <w:proofErr w:type="spellStart"/>
+            <w:proofErr w:type="gramStart"/>
+            <w:r>
+              <w:rPr>
+                <w:sz w:val="20"/>
+                <w:szCs w:val="20"/>
+              </w:rPr>
+              <w:t>main.dart</w:t>
+            </w:r>
+            <w:proofErr w:type="spellEnd"/>
+            <w:proofErr w:type="gramEnd"/>
+            <w:r>
+              <w:rPr>
+                <w:sz w:val="20"/>
+                <w:szCs w:val="20"/>
+              </w:rPr>
+              <w:t xml:space="preserve"> code in Android Studio</w:t>
             </w:r>
           </w:p>
         </w:tc>
@@ -3806,8 +3842,6 @@
             </w:pPr>
             <w:r>
               <w:rPr>
-                <w:i/>
-                <w:iCs/>
                 <w:sz w:val="20"/>
                 <w:szCs w:val="20"/>
               </w:rPr>
@@ -3885,8 +3919,6 @@
               <w:rPr>
                 <w:b/>
                 <w:bCs/>
-                <w:i/>
-                <w:iCs/>
                 <w:sz w:val="20"/>
                 <w:szCs w:val="20"/>
               </w:rPr>
@@ -3895,14 +3927,12 @@
               <w:rPr>
                 <w:b/>
                 <w:bCs/>
-                <w:i/>
-                <w:iCs/>
                 <w:noProof/>
                 <w:sz w:val="20"/>
                 <w:szCs w:val="20"/>
               </w:rPr>
               <w:drawing>
-                <wp:inline distT="0" distB="0" distL="0" distR="0" wp14:anchorId="0AD1E5A6" wp14:editId="09311D4C">
+                <wp:inline distT="0" distB="0" distL="0" distR="0" wp14:anchorId="0AD1E5A6" wp14:editId="71C7A869">
                   <wp:extent cx="2807263" cy="1822450"/>
                   <wp:effectExtent l="0" t="0" r="0" b="6350"/>
                   <wp:docPr id="2111052516" name="Picture 14"/>
@@ -3956,8 +3986,6 @@
               <w:rPr>
                 <w:b/>
                 <w:bCs/>
-                <w:i/>
-                <w:iCs/>
                 <w:sz w:val="20"/>
                 <w:szCs w:val="20"/>
               </w:rPr>
@@ -3966,8 +3994,6 @@
           <w:p>
             <w:r>
               <w:rPr>
-                <w:i/>
-                <w:iCs/>
                 <w:sz w:val="20"/>
                 <w:szCs w:val="20"/>
               </w:rPr>
@@ -4153,12 +4179,18 @@
     </w:p>
     <w:p>
       <w:r>
-        <w:rPr>
-          <w:i/>
-          <w:iCs/>
-        </w:rPr>
         <w:lastRenderedPageBreak/>
-        <w:t>This week I set up the full Flutter development environment from scratch. The biggest challenge was configuring the Flutter SDK path and resolving Gradle build errors caused by syntax mistakes in main.dart. I learned that CLI tools are more reliable than GUI wizards for precise project setup</w:t>
+        <w:t xml:space="preserve">This week I set up the full Flutter development environment from scratch. The biggest challenge was configuring the Flutter SDK path and resolving Gradle build errors caused by syntax mistakes in </w:t>
+      </w:r>
+      <w:proofErr w:type="spellStart"/>
+      <w:proofErr w:type="gramStart"/>
+      <w:r>
+        <w:t>main.dart</w:t>
+      </w:r>
+      <w:proofErr w:type="spellEnd"/>
+      <w:proofErr w:type="gramEnd"/>
+      <w:r>
+        <w:t>. I learned that CLI tools are more reliable than GUI wizards for precise project setup</w:t>
       </w:r>
       <w:r>
         <w:br w:type="page"/>
@@ -4231,7 +4263,15 @@
         <w:contextualSpacing w:val="0"/>
       </w:pPr>
       <w:r>
-        <w:t>Created Firebase project 'dukastock' on the free Spark plan at console.firebase.google.com</w:t>
+        <w:t>Created Firebase project '</w:t>
+      </w:r>
+      <w:proofErr w:type="spellStart"/>
+      <w:r>
+        <w:t>dukastock</w:t>
+      </w:r>
+      <w:proofErr w:type="spellEnd"/>
+      <w:r>
+        <w:t>' on the free Spark plan at console.firebase.google.com</w:t>
       </w:r>
     </w:p>
     <w:p>
@@ -4259,7 +4299,15 @@
         <w:contextualSpacing w:val="0"/>
       </w:pPr>
       <w:r>
-        <w:t>Created Cloud Firestore database in Standard edition with test mode security rules, location: europe-west1</w:t>
+        <w:t xml:space="preserve">Created Cloud </w:t>
+      </w:r>
+      <w:proofErr w:type="spellStart"/>
+      <w:r>
+        <w:t>Firestore</w:t>
+      </w:r>
+      <w:proofErr w:type="spellEnd"/>
+      <w:r>
+        <w:t xml:space="preserve"> database in Standard edition with test mode security rules, location: europe-west1</w:t>
       </w:r>
     </w:p>
     <w:p>
@@ -4273,8 +4321,23 @@
         <w:contextualSpacing w:val="0"/>
       </w:pPr>
       <w:r>
-        <w:t>Registered DukaStock Android app in Firebase with package name com.jokacoded.dukastock.dukastock</w:t>
-      </w:r>
+        <w:t xml:space="preserve">Registered DukaStock Android app in Firebase with package name </w:t>
+      </w:r>
+      <w:proofErr w:type="spellStart"/>
+      <w:proofErr w:type="gramStart"/>
+      <w:r>
+        <w:t>com.jokacoded</w:t>
+      </w:r>
+      <w:proofErr w:type="gramEnd"/>
+      <w:r>
+        <w:t>.</w:t>
+      </w:r>
+      <w:proofErr w:type="gramStart"/>
+      <w:r>
+        <w:t>dukastock.dukastock</w:t>
+      </w:r>
+      <w:proofErr w:type="spellEnd"/>
+      <w:proofErr w:type="gramEnd"/>
     </w:p>
     <w:p>
       <w:pPr>
@@ -4287,7 +4350,17 @@
         <w:contextualSpacing w:val="0"/>
       </w:pPr>
       <w:r>
-        <w:t>Downloaded google-services.json and placed it in android/app/ folder of the Flutter project</w:t>
+        <w:t>Downloaded google-</w:t>
+      </w:r>
+      <w:proofErr w:type="spellStart"/>
+      <w:proofErr w:type="gramStart"/>
+      <w:r>
+        <w:t>services.json</w:t>
+      </w:r>
+      <w:proofErr w:type="spellEnd"/>
+      <w:proofErr w:type="gramEnd"/>
+      <w:r>
+        <w:t xml:space="preserve"> and placed it in android/app/ folder of the Flutter project</w:t>
       </w:r>
     </w:p>
     <w:p>
@@ -4301,7 +4374,31 @@
         <w:contextualSpacing w:val="0"/>
       </w:pPr>
       <w:r>
-        <w:t>Added Firebase packages: firebase_core, firebase_auth, cloud_firestore using flutter pub add</w:t>
+        <w:t xml:space="preserve">Added Firebase packages: </w:t>
+      </w:r>
+      <w:proofErr w:type="spellStart"/>
+      <w:r>
+        <w:t>firebase_core</w:t>
+      </w:r>
+      <w:proofErr w:type="spellEnd"/>
+      <w:r>
+        <w:t xml:space="preserve">, </w:t>
+      </w:r>
+      <w:proofErr w:type="spellStart"/>
+      <w:r>
+        <w:t>firebase_auth</w:t>
+      </w:r>
+      <w:proofErr w:type="spellEnd"/>
+      <w:r>
+        <w:t xml:space="preserve">, </w:t>
+      </w:r>
+      <w:proofErr w:type="spellStart"/>
+      <w:r>
+        <w:t>cloud_firestore</w:t>
+      </w:r>
+      <w:proofErr w:type="spellEnd"/>
+      <w:r>
+        <w:t xml:space="preserve"> using flutter pub add</w:t>
       </w:r>
     </w:p>
     <w:p>
@@ -4315,7 +4412,15 @@
         <w:contextualSpacing w:val="0"/>
       </w:pPr>
       <w:r>
-        <w:t>Configured project-level and app-level build.gradle.kts files with Google Services plugin</w:t>
+        <w:t xml:space="preserve">Configured project-level and app-level </w:t>
+      </w:r>
+      <w:proofErr w:type="spellStart"/>
+      <w:r>
+        <w:t>build.gradle.kts</w:t>
+      </w:r>
+      <w:proofErr w:type="spellEnd"/>
+      <w:r>
+        <w:t xml:space="preserve"> files with Google Services plugin</w:t>
       </w:r>
     </w:p>
     <w:p>
@@ -4357,7 +4462,15 @@
         <w:contextualSpacing w:val="0"/>
       </w:pPr>
       <w:r>
-        <w:t>Built role-based Dashboard showing different menus for Retailers and Wholesalers based on Firestore role field</w:t>
+        <w:t xml:space="preserve">Built role-based Dashboard showing different menus for Retailers and Wholesalers based on </w:t>
+      </w:r>
+      <w:proofErr w:type="spellStart"/>
+      <w:r>
+        <w:t>Firestore</w:t>
+      </w:r>
+      <w:proofErr w:type="spellEnd"/>
+      <w:r>
+        <w:t xml:space="preserve"> role field</w:t>
       </w:r>
     </w:p>
     <w:p>
@@ -4399,7 +4512,15 @@
         <w:contextualSpacing w:val="0"/>
       </w:pPr>
       <w:r>
-        <w:t>Verified user data saved correctly in Firestore users collection with name, email, role, and timestamp</w:t>
+        <w:t xml:space="preserve">Verified user data saved correctly in </w:t>
+      </w:r>
+      <w:proofErr w:type="spellStart"/>
+      <w:r>
+        <w:t>Firestore</w:t>
+      </w:r>
+      <w:proofErr w:type="spellEnd"/>
+      <w:r>
+        <w:t xml:space="preserve"> users collection with name, email, role, and timestamp</w:t>
       </w:r>
     </w:p>
     <w:p>
@@ -4510,6 +4631,9 @@
               <w:jc w:val="center"/>
             </w:pPr>
             <w:r>
+              <w:rPr>
+                <w:noProof/>
+              </w:rPr>
               <w:lastRenderedPageBreak/>
               <w:drawing>
                 <wp:inline distT="0" distB="0" distL="0" distR="0" wp14:anchorId="56494608" wp14:editId="1209488E">
@@ -4617,6 +4741,9 @@
               <w:jc w:val="center"/>
             </w:pPr>
             <w:r>
+              <w:rPr>
+                <w:noProof/>
+              </w:rPr>
               <w:drawing>
                 <wp:inline distT="0" distB="0" distL="0" distR="0" wp14:anchorId="4F4CA832" wp14:editId="3DC7F488">
                   <wp:extent cx="4197350" cy="1195405"/>
@@ -4723,6 +4850,9 @@
               <w:jc w:val="center"/>
             </w:pPr>
             <w:r>
+              <w:rPr>
+                <w:noProof/>
+              </w:rPr>
               <w:drawing>
                 <wp:inline distT="0" distB="0" distL="0" distR="0" wp14:anchorId="1DC2C698" wp14:editId="005D300E">
                   <wp:extent cx="4291457" cy="1987550"/>
@@ -4828,16 +4958,13 @@
             <w:pPr>
               <w:jc w:val="center"/>
               <w:rPr>
-                <w:i/>
-                <w:iCs/>
                 <w:sz w:val="20"/>
                 <w:szCs w:val="20"/>
               </w:rPr>
             </w:pPr>
             <w:r>
               <w:rPr>
-                <w:i/>
-                <w:iCs/>
+                <w:noProof/>
                 <w:sz w:val="20"/>
                 <w:szCs w:val="20"/>
               </w:rPr>
@@ -4896,8 +5023,6 @@
             <w:pPr>
               <w:jc w:val="center"/>
               <w:rPr>
-                <w:i/>
-                <w:iCs/>
                 <w:sz w:val="20"/>
                 <w:szCs w:val="20"/>
               </w:rPr>
@@ -4909,8 +5034,6 @@
             </w:pPr>
             <w:r>
               <w:rPr>
-                <w:i/>
-                <w:iCs/>
                 <w:sz w:val="20"/>
                 <w:szCs w:val="20"/>
               </w:rPr>
@@ -4965,8 +5088,11 @@
           </w:tcPr>
           <w:p>
             <w:r>
+              <w:rPr>
+                <w:noProof/>
+              </w:rPr>
               <w:drawing>
-                <wp:inline distT="0" distB="0" distL="0" distR="0" wp14:anchorId="11016A15" wp14:editId="2113ACC2">
+                <wp:inline distT="0" distB="0" distL="0" distR="0" wp14:anchorId="11016A15" wp14:editId="0B986E2F">
                   <wp:extent cx="3498850" cy="2768428"/>
                   <wp:effectExtent l="0" t="0" r="6350" b="0"/>
                   <wp:docPr id="824695433" name="Picture 10"/>
@@ -5022,12 +5148,28 @@
             </w:pPr>
             <w:r>
               <w:rPr>
-                <w:i/>
-                <w:iCs/>
                 <w:sz w:val="20"/>
                 <w:szCs w:val="20"/>
               </w:rPr>
-              <w:t>Screenshot 16: Command Prompt confirming google-services.json in android/app/</w:t>
+              <w:t>Screenshot 16: Command Prompt confirming google-</w:t>
+            </w:r>
+            <w:proofErr w:type="spellStart"/>
+            <w:proofErr w:type="gramStart"/>
+            <w:r>
+              <w:rPr>
+                <w:sz w:val="20"/>
+                <w:szCs w:val="20"/>
+              </w:rPr>
+              <w:t>services.json</w:t>
+            </w:r>
+            <w:proofErr w:type="spellEnd"/>
+            <w:proofErr w:type="gramEnd"/>
+            <w:r>
+              <w:rPr>
+                <w:sz w:val="20"/>
+                <w:szCs w:val="20"/>
+              </w:rPr>
+              <w:t xml:space="preserve"> in android/app/</w:t>
             </w:r>
           </w:p>
         </w:tc>
@@ -5156,8 +5298,6 @@
             </w:pPr>
             <w:r>
               <w:rPr>
-                <w:i/>
-                <w:iCs/>
                 <w:sz w:val="20"/>
                 <w:szCs w:val="20"/>
               </w:rPr>
@@ -5279,8 +5419,6 @@
             </w:pPr>
             <w:r>
               <w:rPr>
-                <w:i/>
-                <w:iCs/>
                 <w:sz w:val="20"/>
                 <w:szCs w:val="20"/>
               </w:rPr>
@@ -5337,8 +5475,6 @@
             <w:pPr>
               <w:jc w:val="center"/>
               <w:rPr>
-                <w:i/>
-                <w:iCs/>
                 <w:sz w:val="20"/>
                 <w:szCs w:val="20"/>
               </w:rPr>
@@ -5404,8 +5540,6 @@
             </w:pPr>
             <w:r>
               <w:rPr>
-                <w:i/>
-                <w:iCs/>
                 <w:sz w:val="20"/>
                 <w:szCs w:val="20"/>
               </w:rPr>
@@ -5462,8 +5596,6 @@
             <w:pPr>
               <w:jc w:val="center"/>
               <w:rPr>
-                <w:i/>
-                <w:iCs/>
                 <w:sz w:val="20"/>
                 <w:szCs w:val="20"/>
               </w:rPr>
@@ -5528,8 +5660,6 @@
             </w:pPr>
             <w:r>
               <w:rPr>
-                <w:i/>
-                <w:iCs/>
                 <w:sz w:val="20"/>
                 <w:szCs w:val="20"/>
               </w:rPr>
@@ -5596,16 +5726,13 @@
             <w:pPr>
               <w:jc w:val="center"/>
               <w:rPr>
-                <w:i/>
-                <w:iCs/>
                 <w:sz w:val="20"/>
                 <w:szCs w:val="20"/>
               </w:rPr>
             </w:pPr>
             <w:r>
               <w:rPr>
-                <w:i/>
-                <w:iCs/>
+                <w:noProof/>
                 <w:sz w:val="20"/>
                 <w:szCs w:val="20"/>
               </w:rPr>
@@ -5653,8 +5780,6 @@
             </w:pPr>
             <w:r>
               <w:rPr>
-                <w:i/>
-                <w:iCs/>
                 <w:sz w:val="20"/>
                 <w:szCs w:val="20"/>
               </w:rPr>
@@ -5734,8 +5859,13 @@
         <w:contextualSpacing w:val="0"/>
       </w:pPr>
       <w:r>
-        <w:t>Cloud Firestore</w:t>
-      </w:r>
+        <w:t xml:space="preserve">Cloud </w:t>
+      </w:r>
+      <w:proofErr w:type="spellStart"/>
+      <w:r>
+        <w:t>Firestore</w:t>
+      </w:r>
+      <w:proofErr w:type="spellEnd"/>
     </w:p>
     <w:p>
       <w:pPr>
@@ -5761,8 +5891,29 @@
         <w:spacing w:before="60" w:after="60"/>
         <w:contextualSpacing w:val="0"/>
       </w:pPr>
-      <w:r>
-        <w:t>firebase_core, firebase_auth, cloud_firestore packages</w:t>
+      <w:proofErr w:type="spellStart"/>
+      <w:r>
+        <w:t>firebase_core</w:t>
+      </w:r>
+      <w:proofErr w:type="spellEnd"/>
+      <w:r>
+        <w:t xml:space="preserve">, </w:t>
+      </w:r>
+      <w:proofErr w:type="spellStart"/>
+      <w:r>
+        <w:t>firebase_auth</w:t>
+      </w:r>
+      <w:proofErr w:type="spellEnd"/>
+      <w:r>
+        <w:t xml:space="preserve">, </w:t>
+      </w:r>
+      <w:proofErr w:type="spellStart"/>
+      <w:r>
+        <w:t>cloud_firestore</w:t>
+      </w:r>
+      <w:proofErr w:type="spellEnd"/>
+      <w:r>
+        <w:t xml:space="preserve"> packages</w:t>
       </w:r>
     </w:p>
     <w:p>
@@ -5854,8 +6005,13 @@
     </w:p>
     <w:p>
       <w:r>
-        <w:t>This week I integrated Firebase into DukaStock and built working authentication. The key challenge was a package name mismatch between Firebase and Flutter which caused a Gradle build failure. I resolved it by registering a new Android app in Firebase with the exact package name from build.gradle.kts</w:t>
-      </w:r>
+        <w:t xml:space="preserve">This week I integrated Firebase into DukaStock and built working authentication. The key challenge was a package name mismatch between Firebase and Flutter which caused a Gradle build failure. I resolved it by registering a new Android app in Firebase with the exact package name from </w:t>
+      </w:r>
+      <w:proofErr w:type="spellStart"/>
+      <w:r>
+        <w:t>build.gradle.kts</w:t>
+      </w:r>
+      <w:proofErr w:type="spellEnd"/>
       <w:r>
         <w:br w:type="page"/>
       </w:r>
@@ -6188,6 +6344,7 @@
             <w:pPr>
               <w:jc w:val="center"/>
             </w:pPr>
+            <w:proofErr w:type="gramStart"/>
             <w:r>
               <w:rPr>
                 <w:rFonts w:ascii="Segoe UI Emoji" w:hAnsi="Segoe UI Emoji" w:cs="Segoe UI Emoji"/>
@@ -6201,7 +6358,15 @@
                 <w:b/>
                 <w:bCs/>
               </w:rPr>
-              <w:t xml:space="preserve">  INSERT SCREENSHOT HERE</w:t>
+              <w:t xml:space="preserve">  INSERT</w:t>
+            </w:r>
+            <w:proofErr w:type="gramEnd"/>
+            <w:r>
+              <w:rPr>
+                <w:b/>
+                <w:bCs/>
+              </w:rPr>
+              <w:t xml:space="preserve"> SCREENSHOT HERE</w:t>
             </w:r>
           </w:p>
           <w:p>
@@ -6210,8 +6375,6 @@
             </w:pPr>
             <w:r>
               <w:rPr>
-                <w:i/>
-                <w:iCs/>
                 <w:sz w:val="20"/>
                 <w:szCs w:val="20"/>
               </w:rPr>
@@ -6268,6 +6431,7 @@
             <w:pPr>
               <w:jc w:val="center"/>
             </w:pPr>
+            <w:proofErr w:type="gramStart"/>
             <w:r>
               <w:rPr>
                 <w:rFonts w:ascii="Segoe UI Emoji" w:hAnsi="Segoe UI Emoji" w:cs="Segoe UI Emoji"/>
@@ -6281,7 +6445,15 @@
                 <w:b/>
                 <w:bCs/>
               </w:rPr>
-              <w:t xml:space="preserve">  INSERT SCREENSHOT HERE</w:t>
+              <w:t xml:space="preserve">  INSERT</w:t>
+            </w:r>
+            <w:proofErr w:type="gramEnd"/>
+            <w:r>
+              <w:rPr>
+                <w:b/>
+                <w:bCs/>
+              </w:rPr>
+              <w:t xml:space="preserve"> SCREENSHOT HERE</w:t>
             </w:r>
           </w:p>
           <w:p>
@@ -6290,8 +6462,6 @@
             </w:pPr>
             <w:r>
               <w:rPr>
-                <w:i/>
-                <w:iCs/>
                 <w:sz w:val="20"/>
                 <w:szCs w:val="20"/>
               </w:rPr>
@@ -6348,6 +6518,7 @@
             <w:pPr>
               <w:jc w:val="center"/>
             </w:pPr>
+            <w:proofErr w:type="gramStart"/>
             <w:r>
               <w:rPr>
                 <w:rFonts w:ascii="Segoe UI Emoji" w:hAnsi="Segoe UI Emoji" w:cs="Segoe UI Emoji"/>
@@ -6361,7 +6532,15 @@
                 <w:b/>
                 <w:bCs/>
               </w:rPr>
-              <w:t xml:space="preserve">  INSERT SCREENSHOT HERE</w:t>
+              <w:t xml:space="preserve">  INSERT</w:t>
+            </w:r>
+            <w:proofErr w:type="gramEnd"/>
+            <w:r>
+              <w:rPr>
+                <w:b/>
+                <w:bCs/>
+              </w:rPr>
+              <w:t xml:space="preserve"> SCREENSHOT HERE</w:t>
             </w:r>
           </w:p>
           <w:p>
@@ -6370,8 +6549,6 @@
             </w:pPr>
             <w:r>
               <w:rPr>
-                <w:i/>
-                <w:iCs/>
                 <w:sz w:val="20"/>
                 <w:szCs w:val="20"/>
               </w:rPr>
@@ -6428,6 +6605,7 @@
             <w:pPr>
               <w:jc w:val="center"/>
             </w:pPr>
+            <w:proofErr w:type="gramStart"/>
             <w:r>
               <w:rPr>
                 <w:rFonts w:ascii="Segoe UI Emoji" w:hAnsi="Segoe UI Emoji" w:cs="Segoe UI Emoji"/>
@@ -6442,7 +6620,15 @@
                 <w:b/>
                 <w:bCs/>
               </w:rPr>
-              <w:t xml:space="preserve">  INSERT SCREENSHOT HERE</w:t>
+              <w:t xml:space="preserve">  INSERT</w:t>
+            </w:r>
+            <w:proofErr w:type="gramEnd"/>
+            <w:r>
+              <w:rPr>
+                <w:b/>
+                <w:bCs/>
+              </w:rPr>
+              <w:t xml:space="preserve"> SCREENSHOT HERE</w:t>
             </w:r>
           </w:p>
           <w:p>
@@ -6451,8 +6637,6 @@
             </w:pPr>
             <w:r>
               <w:rPr>
-                <w:i/>
-                <w:iCs/>
                 <w:sz w:val="20"/>
                 <w:szCs w:val="20"/>
               </w:rPr>
@@ -6509,6 +6693,7 @@
             <w:pPr>
               <w:jc w:val="center"/>
             </w:pPr>
+            <w:proofErr w:type="gramStart"/>
             <w:r>
               <w:rPr>
                 <w:rFonts w:ascii="Segoe UI Emoji" w:hAnsi="Segoe UI Emoji" w:cs="Segoe UI Emoji"/>
@@ -6522,7 +6707,15 @@
                 <w:b/>
                 <w:bCs/>
               </w:rPr>
-              <w:t xml:space="preserve">  INSERT SCREENSHOT HERE</w:t>
+              <w:t xml:space="preserve">  INSERT</w:t>
+            </w:r>
+            <w:proofErr w:type="gramEnd"/>
+            <w:r>
+              <w:rPr>
+                <w:b/>
+                <w:bCs/>
+              </w:rPr>
+              <w:t xml:space="preserve"> SCREENSHOT HERE</w:t>
             </w:r>
           </w:p>
           <w:p>
@@ -6531,8 +6724,6 @@
             </w:pPr>
             <w:r>
               <w:rPr>
-                <w:i/>
-                <w:iCs/>
                 <w:sz w:val="20"/>
                 <w:szCs w:val="20"/>
               </w:rPr>
@@ -6589,6 +6780,7 @@
             <w:pPr>
               <w:jc w:val="center"/>
             </w:pPr>
+            <w:proofErr w:type="gramStart"/>
             <w:r>
               <w:rPr>
                 <w:rFonts w:ascii="Segoe UI Emoji" w:hAnsi="Segoe UI Emoji" w:cs="Segoe UI Emoji"/>
@@ -6602,7 +6794,15 @@
                 <w:b/>
                 <w:bCs/>
               </w:rPr>
-              <w:t xml:space="preserve">  INSERT SCREENSHOT HERE</w:t>
+              <w:t xml:space="preserve">  INSERT</w:t>
+            </w:r>
+            <w:proofErr w:type="gramEnd"/>
+            <w:r>
+              <w:rPr>
+                <w:b/>
+                <w:bCs/>
+              </w:rPr>
+              <w:t xml:space="preserve"> SCREENSHOT HERE</w:t>
             </w:r>
           </w:p>
           <w:p>
@@ -6611,8 +6811,6 @@
             </w:pPr>
             <w:r>
               <w:rPr>
-                <w:i/>
-                <w:iCs/>
                 <w:sz w:val="20"/>
                 <w:szCs w:val="20"/>
               </w:rPr>
@@ -6669,6 +6867,7 @@
             <w:pPr>
               <w:jc w:val="center"/>
             </w:pPr>
+            <w:proofErr w:type="gramStart"/>
             <w:r>
               <w:rPr>
                 <w:rFonts w:ascii="Segoe UI Emoji" w:hAnsi="Segoe UI Emoji" w:cs="Segoe UI Emoji"/>
@@ -6682,7 +6881,15 @@
                 <w:b/>
                 <w:bCs/>
               </w:rPr>
-              <w:t xml:space="preserve">  INSERT SCREENSHOT HERE</w:t>
+              <w:t xml:space="preserve">  INSERT</w:t>
+            </w:r>
+            <w:proofErr w:type="gramEnd"/>
+            <w:r>
+              <w:rPr>
+                <w:b/>
+                <w:bCs/>
+              </w:rPr>
+              <w:t xml:space="preserve"> SCREENSHOT HERE</w:t>
             </w:r>
           </w:p>
           <w:p>
@@ -6691,8 +6898,6 @@
             </w:pPr>
             <w:r>
               <w:rPr>
-                <w:i/>
-                <w:iCs/>
                 <w:sz w:val="20"/>
                 <w:szCs w:val="20"/>
               </w:rPr>
@@ -6749,6 +6954,7 @@
             <w:pPr>
               <w:jc w:val="center"/>
             </w:pPr>
+            <w:proofErr w:type="gramStart"/>
             <w:r>
               <w:rPr>
                 <w:rFonts w:ascii="Segoe UI Emoji" w:hAnsi="Segoe UI Emoji" w:cs="Segoe UI Emoji"/>
@@ -6762,7 +6968,15 @@
                 <w:b/>
                 <w:bCs/>
               </w:rPr>
-              <w:t xml:space="preserve">  INSERT SCREENSHOT HERE</w:t>
+              <w:t xml:space="preserve">  INSERT</w:t>
+            </w:r>
+            <w:proofErr w:type="gramEnd"/>
+            <w:r>
+              <w:rPr>
+                <w:b/>
+                <w:bCs/>
+              </w:rPr>
+              <w:t xml:space="preserve"> SCREENSHOT HERE</w:t>
             </w:r>
           </w:p>
           <w:p>
@@ -6771,8 +6985,6 @@
             </w:pPr>
             <w:r>
               <w:rPr>
-                <w:i/>
-                <w:iCs/>
                 <w:sz w:val="20"/>
                 <w:szCs w:val="20"/>
               </w:rPr>
@@ -6930,31 +7142,13 @@
     </w:p>
     <w:p>
       <w:pPr>
-        <w:pBdr>
-          <w:top w:val="single" w:sz="1" w:space="0" w:color="CCCCCC"/>
-          <w:left w:val="single" w:sz="6" w:space="0" w:color="2E7D32"/>
-          <w:bottom w:val="single" w:sz="1" w:space="0" w:color="CCCCCC"/>
-          <w:right w:val="single" w:sz="1" w:space="0" w:color="CCCCCC"/>
-        </w:pBdr>
-        <w:shd w:val="clear" w:color="auto" w:fill="F9FBE7"/>
-        <w:spacing w:before="80" w:after="80"/>
-      </w:pPr>
-      <w:r>
-        <w:rPr>
-          <w:i/>
-          <w:iCs/>
-        </w:rPr>
-        <w:t>This week I designed all DukaStock screens in Figma before writing code — a professional workflow. Translating Figma designs to Flutter required careful attention to spacing, colors, and component structure. I learned that designing first saves significant coding time by eliminating guesswork.</w:t>
-      </w:r>
-    </w:p>
-    <w:p>
-      <w:pPr>
         <w:spacing w:before="100" w:after="100"/>
       </w:pPr>
-    </w:p>
-    <w:p>
-      <w:r>
-        <w:br w:type="page"/>
+      <w:r>
+        <w:t>T</w:t>
+      </w:r>
+      <w:r>
+        <w:t>his week I designed all DukaStock screens in Figma before writing code — a professional workflow. Translating Figma designs to Flutter required careful attention to spacing, colors, and component structure. I learned that designing first saves significant coding time by eliminating guesswork</w:t>
       </w:r>
     </w:p>
     <w:p/>
@@ -7736,6 +7930,7 @@
   <w:style w:type="character" w:default="1" w:styleId="DefaultParagraphFont">
     <w:name w:val="Default Paragraph Font"/>
     <w:uiPriority w:val="1"/>
+    <w:semiHidden/>
     <w:unhideWhenUsed/>
   </w:style>
   <w:style w:type="table" w:default="1" w:styleId="TableNormal">
@@ -8186,6 +8381,77 @@
       <w:ind w:left="220"/>
     </w:pPr>
   </w:style>
+  <w:style w:type="character" w:styleId="CommentReference">
+    <w:name w:val="annotation reference"/>
+    <w:basedOn w:val="DefaultParagraphFont"/>
+    <w:uiPriority w:val="99"/>
+    <w:semiHidden/>
+    <w:unhideWhenUsed/>
+    <w:rsid w:val="00A24C2B"/>
+    <w:rPr>
+      <w:sz w:val="16"/>
+      <w:szCs w:val="16"/>
+    </w:rPr>
+  </w:style>
+  <w:style w:type="paragraph" w:styleId="CommentText">
+    <w:name w:val="annotation text"/>
+    <w:basedOn w:val="Normal"/>
+    <w:link w:val="CommentTextChar"/>
+    <w:uiPriority w:val="99"/>
+    <w:semiHidden/>
+    <w:unhideWhenUsed/>
+    <w:rsid w:val="00A24C2B"/>
+    <w:rPr>
+      <w:sz w:val="20"/>
+      <w:szCs w:val="20"/>
+    </w:rPr>
+  </w:style>
+  <w:style w:type="character" w:customStyle="1" w:styleId="CommentTextChar">
+    <w:name w:val="Comment Text Char"/>
+    <w:basedOn w:val="DefaultParagraphFont"/>
+    <w:link w:val="CommentText"/>
+    <w:uiPriority w:val="99"/>
+    <w:semiHidden/>
+    <w:rsid w:val="00A24C2B"/>
+    <w:rPr>
+      <w:rFonts w:ascii="Arial" w:eastAsia="Arial" w:hAnsi="Arial" w:cs="Arial"/>
+      <w:kern w:val="0"/>
+      <w:sz w:val="20"/>
+      <w:szCs w:val="20"/>
+      <w14:ligatures w14:val="none"/>
+    </w:rPr>
+  </w:style>
+  <w:style w:type="paragraph" w:styleId="CommentSubject">
+    <w:name w:val="annotation subject"/>
+    <w:basedOn w:val="CommentText"/>
+    <w:next w:val="CommentText"/>
+    <w:link w:val="CommentSubjectChar"/>
+    <w:uiPriority w:val="99"/>
+    <w:semiHidden/>
+    <w:unhideWhenUsed/>
+    <w:rsid w:val="00A24C2B"/>
+    <w:rPr>
+      <w:b/>
+      <w:bCs/>
+    </w:rPr>
+  </w:style>
+  <w:style w:type="character" w:customStyle="1" w:styleId="CommentSubjectChar">
+    <w:name w:val="Comment Subject Char"/>
+    <w:basedOn w:val="CommentTextChar"/>
+    <w:link w:val="CommentSubject"/>
+    <w:uiPriority w:val="99"/>
+    <w:semiHidden/>
+    <w:rsid w:val="00A24C2B"/>
+    <w:rPr>
+      <w:rFonts w:ascii="Arial" w:eastAsia="Arial" w:hAnsi="Arial" w:cs="Arial"/>
+      <w:b/>
+      <w:bCs/>
+      <w:kern w:val="0"/>
+      <w:sz w:val="20"/>
+      <w:szCs w:val="20"/>
+      <w14:ligatures w14:val="none"/>
+    </w:rPr>
+  </w:style>
 </w:styles>
 </file>
 

</xml_diff>